<commit_message>
status: before add new figures
</commit_message>
<xml_diff>
--- a/docs/manuscript/index.docx
+++ b/docs/manuscript/index.docx
@@ -7,7 +7,7 @@
         <w:pStyle w:val="Title"/>
       </w:pPr>
       <w:r>
-        <w:t xml:space="preserve">Thermal comfort responses to ankle-level draft under winter clothing conditions</w:t>
+        <w:t xml:space="preserve">Ankle draft risk model under winter clothing conditions</w:t>
       </w:r>
     </w:p>
     <w:p>
@@ -47,7 +47,7 @@
         <w:pStyle w:val="Date"/>
       </w:pPr>
       <w:r>
-        <w:t xml:space="preserve">2026-04-30</w:t>
+        <w:t xml:space="preserve">2026-05-19</w:t>
       </w:r>
     </w:p>
     <w:p>
@@ -160,67 +160,67 @@
         <w:t xml:space="preserve"> </w:t>
       </w:r>
       <w:r>
-        <w:t xml:space="preserve">from studies in which participants wore summer clothing with exposed</w:t>
-      </w:r>
-      <w:r>
-        <w:t xml:space="preserve"> </w:t>
-      </w:r>
-      <w:r>
-        <w:t xml:space="preserve">ankles (~0.5 clo), potentially leading to overly conservative perimeter</w:t>
-      </w:r>
-      <w:r>
-        <w:t xml:space="preserve"> </w:t>
-      </w:r>
-      <w:r>
-        <w:t xml:space="preserve">heating requirements in winter conditions where office occupants</w:t>
-      </w:r>
-      <w:r>
-        <w:t xml:space="preserve"> </w:t>
-      </w:r>
-      <w:r>
-        <w:t xml:space="preserve">typically wear long trousers, socks, and closed-toe shoes (~0.75 clo).</w:t>
-      </w:r>
-      <w:r>
-        <w:t xml:space="preserve"> </w:t>
-      </w:r>
-      <w:r>
-        <w:t xml:space="preserve">This study evaluated thermal comfort responses to ankle-level draft</w:t>
-      </w:r>
-      <w:r>
-        <w:t xml:space="preserve"> </w:t>
-      </w:r>
-      <w:r>
-        <w:t xml:space="preserve">under such winter clothing conditions through controlled laboratory</w:t>
-      </w:r>
-      <w:r>
-        <w:t xml:space="preserve"> </w:t>
-      </w:r>
-      <w:r>
-        <w:t xml:space="preserve">experiments with 51 participants. Using a within-subjects</w:t>
-      </w:r>
-      <w:r>
-        <w:t xml:space="preserve"> </w:t>
-      </w:r>
-      <w:r>
-        <w:t xml:space="preserve">repeated-measures design, we exposed participants to nine conditions</w:t>
-      </w:r>
-      <w:r>
-        <w:t xml:space="preserve"> </w:t>
-      </w:r>
-      <w:r>
-        <w:t xml:space="preserve">varying supply air temperature (15°C, 17°C, 19°C) and ankle-level air</w:t>
-      </w:r>
-      <w:r>
-        <w:t xml:space="preserve"> </w:t>
-      </w:r>
-      <w:r>
-        <w:t xml:space="preserve">speed (0.1–0.7 m/s) simulating window downdraft while they wore clothing</w:t>
-      </w:r>
-      <w:r>
-        <w:t xml:space="preserve"> </w:t>
-      </w:r>
-      <w:r>
-        <w:t xml:space="preserve">ensembles targeting 0.75 clo.</w:t>
+        <w:t xml:space="preserve">from studies in which participants mainly wore summer clothing with</w:t>
+      </w:r>
+      <w:r>
+        <w:t xml:space="preserve"> </w:t>
+      </w:r>
+      <w:r>
+        <w:t xml:space="preserve">exposed ankles (~0.5 clo), potentially leading to overly conservative</w:t>
+      </w:r>
+      <w:r>
+        <w:t xml:space="preserve"> </w:t>
+      </w:r>
+      <w:r>
+        <w:t xml:space="preserve">perimeter heating or facade insulation requirements in winter conditions</w:t>
+      </w:r>
+      <w:r>
+        <w:t xml:space="preserve"> </w:t>
+      </w:r>
+      <w:r>
+        <w:t xml:space="preserve">where occupants typically wear long trousers, socks, and closed-toe</w:t>
+      </w:r>
+      <w:r>
+        <w:t xml:space="preserve"> </w:t>
+      </w:r>
+      <w:r>
+        <w:t xml:space="preserve">shoes (~0.75 clo). This study evaluated thermal comfort responses to</w:t>
+      </w:r>
+      <w:r>
+        <w:t xml:space="preserve"> </w:t>
+      </w:r>
+      <w:r>
+        <w:t xml:space="preserve">ankle-level draft under such winter clothing conditions through</w:t>
+      </w:r>
+      <w:r>
+        <w:t xml:space="preserve"> </w:t>
+      </w:r>
+      <w:r>
+        <w:t xml:space="preserve">controlled laboratory experiments with 51 participants. Using a</w:t>
+      </w:r>
+      <w:r>
+        <w:t xml:space="preserve"> </w:t>
+      </w:r>
+      <w:r>
+        <w:t xml:space="preserve">within-subjects repeated-measures design, we exposed participants to</w:t>
+      </w:r>
+      <w:r>
+        <w:t xml:space="preserve"> </w:t>
+      </w:r>
+      <w:r>
+        <w:t xml:space="preserve">nine conditions varying supply air temperature (15, 17, and 19°C) and</w:t>
+      </w:r>
+      <w:r>
+        <w:t xml:space="preserve"> </w:t>
+      </w:r>
+      <w:r>
+        <w:t xml:space="preserve">ankle-level air speed (0.1–0.7 m/s) simulating window downdraft while</w:t>
+      </w:r>
+      <w:r>
+        <w:t xml:space="preserve"> </w:t>
+      </w:r>
+      <w:r>
+        <w:t xml:space="preserve">they wore clothing ensembles targeting 0.75 clo.</w:t>
       </w:r>
     </w:p>
     <w:p>
@@ -252,19 +252,19 @@
         <w:t xml:space="preserve"> </w:t>
       </w:r>
       <w:r>
-        <w:t xml:space="preserve">average of 2.8 times and by as much as 39 percentage points at high air</w:t>
-      </w:r>
-      <w:r>
-        <w:t xml:space="preserve"> </w:t>
-      </w:r>
-      <w:r>
-        <w:t xml:space="preserve">speeds. We fit generalized linear mixed-effects models to data from this</w:t>
-      </w:r>
-      <w:r>
-        <w:t xml:space="preserve"> </w:t>
-      </w:r>
-      <w:r>
-        <w:t xml:space="preserve">study and prior research, developing separate prediction equations for</w:t>
+        <w:t xml:space="preserve">average of 2.8 times and by as much as 39% at high air speeds. We fit</w:t>
+      </w:r>
+      <w:r>
+        <w:t xml:space="preserve"> </w:t>
+      </w:r>
+      <w:r>
+        <w:t xml:space="preserve">generalized linear mixed-effects models to data from this study and</w:t>
+      </w:r>
+      <w:r>
+        <w:t xml:space="preserve"> </w:t>
+      </w:r>
+      <w:r>
+        <w:t xml:space="preserve">prior research, developing separate prediction equations for</w:t>
       </w:r>
       <w:r>
         <w:t xml:space="preserve"> </w:t>
@@ -320,19 +320,19 @@
         <w:t xml:space="preserve"> </w:t>
       </w:r>
       <w:r>
-        <w:t xml:space="preserve">in perimeter heating requirements without compromising occupant comfort,</w:t>
-      </w:r>
-      <w:r>
-        <w:t xml:space="preserve"> </w:t>
-      </w:r>
-      <w:r>
-        <w:t xml:space="preserve">with associated benefits for installation costs, energy consumption, and</w:t>
-      </w:r>
-      <w:r>
-        <w:t xml:space="preserve"> </w:t>
-      </w:r>
-      <w:r>
-        <w:t xml:space="preserve">carbon emissions.</w:t>
+        <w:t xml:space="preserve">in perimeter heating and facade insulation requirements without</w:t>
+      </w:r>
+      <w:r>
+        <w:t xml:space="preserve"> </w:t>
+      </w:r>
+      <w:r>
+        <w:t xml:space="preserve">compromising occupant comfort, with associated benefits for installation</w:t>
+      </w:r>
+      <w:r>
+        <w:t xml:space="preserve"> </w:t>
+      </w:r>
+      <w:r>
+        <w:t xml:space="preserve">costs, energy use, and carbon emissions.</w:t>
       </w:r>
     </w:p>
     <w:bookmarkEnd w:id="21"/>
@@ -356,37 +356,7 @@
         <w:t xml:space="preserve"> </w:t>
       </w:r>
       <w:r>
-        <w:t xml:space="preserve">discomfort in buildings during winter. When outdoor temperatures drop,</w:t>
-      </w:r>
-      <w:r>
-        <w:t xml:space="preserve"> </w:t>
-      </w:r>
-      <w:r>
-        <w:t xml:space="preserve">the interior surface of windows, particularly large or poorly insulated</w:t>
-      </w:r>
-      <w:r>
-        <w:t xml:space="preserve"> </w:t>
-      </w:r>
-      <w:r>
-        <w:t xml:space="preserve">glazing, becomes significantly cooler than the surrounding air. This</w:t>
-      </w:r>
-      <w:r>
-        <w:t xml:space="preserve"> </w:t>
-      </w:r>
-      <w:r>
-        <w:t xml:space="preserve">temperature differential causes nearby air to cool, increase in density,</w:t>
-      </w:r>
-      <w:r>
-        <w:t xml:space="preserve"> </w:t>
-      </w:r>
-      <w:r>
-        <w:t xml:space="preserve">and descend, creating a localized airflow pattern that can cause</w:t>
-      </w:r>
-      <w:r>
-        <w:t xml:space="preserve"> </w:t>
-      </w:r>
-      <w:r>
-        <w:t xml:space="preserve">discomfort at the lower extremities of seated occupants</w:t>
+        <w:t xml:space="preserve">discomfort in buildings during winter</w:t>
       </w:r>
       <w:r>
         <w:t xml:space="preserve"> </w:t>
@@ -394,7 +364,21 @@
       <w:r>
         <w:t xml:space="preserve">(</w:t>
       </w:r>
-      <w:hyperlink w:anchor="ref-heiselbergDraftComfortReview1994">
+      <w:hyperlink w:anchor="ref-fangerAirTurbulenceSensation1988">
+        <w:r>
+          <w:rPr>
+            <w:rStyle w:val="Hyperlink"/>
+          </w:rPr>
+          <w:t xml:space="preserve">Fanger et al., 1988</w:t>
+        </w:r>
+      </w:hyperlink>
+      <w:r>
+        <w:t xml:space="preserve">;</w:t>
+      </w:r>
+      <w:r>
+        <w:t xml:space="preserve"> </w:t>
+      </w:r>
+      <w:hyperlink w:anchor="ref-heiselbergDraughtRiskCold1994">
         <w:r>
           <w:rPr>
             <w:rStyle w:val="Hyperlink"/>
@@ -403,31 +387,107 @@
         </w:r>
       </w:hyperlink>
       <w:r>
-        <w:t xml:space="preserve"> </w:t>
-      </w:r>
-      <w:r>
         <w:t xml:space="preserve">)</w:t>
       </w:r>
       <w:r>
+        <w:t xml:space="preserve">. When outdoor temperatures drop, the</w:t>
+      </w:r>
+      <w:r>
+        <w:t xml:space="preserve"> </w:t>
+      </w:r>
+      <w:r>
+        <w:t xml:space="preserve">interior surface of windows, particularly large or poorly insulated</w:t>
+      </w:r>
+      <w:r>
+        <w:t xml:space="preserve"> </w:t>
+      </w:r>
+      <w:r>
+        <w:t xml:space="preserve">glazing, becomes significantly cooler than the surrounding air. This</w:t>
+      </w:r>
+      <w:r>
+        <w:t xml:space="preserve"> </w:t>
+      </w:r>
+      <w:r>
+        <w:t xml:space="preserve">temperature differential causes nearby air to cool, increase in density,</w:t>
+      </w:r>
+      <w:r>
+        <w:t xml:space="preserve"> </w:t>
+      </w:r>
+      <w:r>
+        <w:t xml:space="preserve">and descend, creating a localized airflow pattern that can cause</w:t>
+      </w:r>
+      <w:r>
+        <w:t xml:space="preserve"> </w:t>
+      </w:r>
+      <w:r>
+        <w:t xml:space="preserve">discomfort at the lower extremities of seated occupants</w:t>
+      </w:r>
+      <w:r>
+        <w:t xml:space="preserve"> </w:t>
+      </w:r>
+      <w:r>
+        <w:t xml:space="preserve">(</w:t>
+      </w:r>
+      <w:hyperlink w:anchor="ref-heiselbergDraughtRiskCold1994">
+        <w:r>
+          <w:rPr>
+            <w:rStyle w:val="Hyperlink"/>
+          </w:rPr>
+          <w:t xml:space="preserve">Heiselberg, 1994</w:t>
+        </w:r>
+      </w:hyperlink>
+      <w:r>
+        <w:t xml:space="preserve">;</w:t>
+      </w:r>
+      <w:r>
+        <w:t xml:space="preserve"> </w:t>
+      </w:r>
+      <w:hyperlink w:anchor="Xeba2464567e621ce2a405bbbf83703f55acd515">
+        <w:r>
+          <w:rPr>
+            <w:rStyle w:val="Hyperlink"/>
+          </w:rPr>
+          <w:t xml:space="preserve">Larsson &amp; Moshfegh, 2002</w:t>
+        </w:r>
+      </w:hyperlink>
+      <w:r>
+        <w:t xml:space="preserve"> </w:t>
+      </w:r>
+      <w:r>
+        <w:t xml:space="preserve">)</w:t>
+      </w:r>
+      <w:r>
         <w:t xml:space="preserve">. Building designers</w:t>
       </w:r>
       <w:r>
         <w:t xml:space="preserve"> </w:t>
       </w:r>
       <w:r>
-        <w:t xml:space="preserve">typically address this issue by installing perimeter heating systems,</w:t>
-      </w:r>
-      <w:r>
-        <w:t xml:space="preserve"> </w:t>
-      </w:r>
-      <w:r>
-        <w:t xml:space="preserve">such as radiators or in-floor heating, to counteract the downdraft</w:t>
-      </w:r>
-      <w:r>
-        <w:t xml:space="preserve"> </w:t>
-      </w:r>
-      <w:r>
-        <w:t xml:space="preserve">effect and to prevent thermal discomfort in the ankle region.</w:t>
+        <w:t xml:space="preserve">typically address this issue by increasing the insulation level of</w:t>
+      </w:r>
+      <w:r>
+        <w:t xml:space="preserve"> </w:t>
+      </w:r>
+      <w:r>
+        <w:t xml:space="preserve">windows, so that the interior surface temperature is higher, adding</w:t>
+      </w:r>
+      <w:r>
+        <w:t xml:space="preserve"> </w:t>
+      </w:r>
+      <w:r>
+        <w:t xml:space="preserve">mullions to break the downward flow and by installing perimeter heating</w:t>
+      </w:r>
+      <w:r>
+        <w:t xml:space="preserve"> </w:t>
+      </w:r>
+      <w:r>
+        <w:t xml:space="preserve">systems, such as radiators or in-floor heating, to counteract the</w:t>
+      </w:r>
+      <w:r>
+        <w:t xml:space="preserve"> </w:t>
+      </w:r>
+      <w:r>
+        <w:t xml:space="preserve">downdraft effect and to prevent thermal discomfort in the ankle region.</w:t>
       </w:r>
     </w:p>
     <w:p>
@@ -479,13 +539,25 @@
         <w:t xml:space="preserve"> </w:t>
       </w:r>
       <w:r>
-        <w:t xml:space="preserve">as whole-body thermal sensation. This model, now incorporated into</w:t>
-      </w:r>
-      <w:r>
-        <w:t xml:space="preserve"> </w:t>
-      </w:r>
-      <w:r>
-        <w:t xml:space="preserve">ASHRAE Standard 55</w:t>
+        <w:t xml:space="preserve">as whole-body thermal sensation. This model was derived from laboratory</w:t>
+      </w:r>
+      <w:r>
+        <w:t xml:space="preserve"> </w:t>
+      </w:r>
+      <w:r>
+        <w:t xml:space="preserve">experiments conducted under cooling conditions typical of underfloor air</w:t>
+      </w:r>
+      <w:r>
+        <w:t xml:space="preserve"> </w:t>
+      </w:r>
+      <w:r>
+        <w:t xml:space="preserve">distribution (UFAD) and displacement ventilation systems and is</w:t>
+      </w:r>
+      <w:r>
+        <w:t xml:space="preserve"> </w:t>
+      </w:r>
+      <w:r>
+        <w:t xml:space="preserve">incorporated into ASHRAE Standard 55</w:t>
       </w:r>
       <w:r>
         <w:t xml:space="preserve"> </w:t>
@@ -505,31 +577,19 @@
         <w:t xml:space="preserve">)</w:t>
       </w:r>
       <w:r>
-        <w:t xml:space="preserve">, was derived from</w:t>
-      </w:r>
-      <w:r>
-        <w:t xml:space="preserve"> </w:t>
-      </w:r>
-      <w:r>
-        <w:t xml:space="preserve">laboratory experiments conducted under cooling conditions typical of</w:t>
-      </w:r>
-      <w:r>
-        <w:t xml:space="preserve"> </w:t>
-      </w:r>
-      <w:r>
-        <w:t xml:space="preserve">underfloor air distribution (UFAD) and displacement ventilation systems.</w:t>
-      </w:r>
-      <w:r>
-        <w:t xml:space="preserve"> </w:t>
-      </w:r>
-      <w:r>
-        <w:t xml:space="preserve">Importantly, participants in these foundational studies, including an</w:t>
-      </w:r>
-      <w:r>
-        <w:t xml:space="preserve"> </w:t>
-      </w:r>
-      <w:r>
-        <w:t xml:space="preserve">earlier investigation by</w:t>
+        <w:t xml:space="preserve">.</w:t>
+      </w:r>
+      <w:r>
+        <w:t xml:space="preserve"> </w:t>
+      </w:r>
+      <w:r>
+        <w:t xml:space="preserve">Importantly, the 110 participants in these foundational studies,</w:t>
+      </w:r>
+      <w:r>
+        <w:t xml:space="preserve"> </w:t>
+      </w:r>
+      <w:r>
+        <w:t xml:space="preserve">including an earlier investigation by</w:t>
       </w:r>
       <w:r>
         <w:t xml:space="preserve"> </w:t>
@@ -549,19 +609,19 @@
         <w:t xml:space="preserve">)</w:t>
       </w:r>
       <w:r>
-        <w:t xml:space="preserve">, wore</w:t>
-      </w:r>
-      <w:r>
-        <w:t xml:space="preserve"> </w:t>
-      </w:r>
-      <w:r>
-        <w:t xml:space="preserve">summer clothing with exposed ankles, resulting in clothing insulation</w:t>
-      </w:r>
-      <w:r>
-        <w:t xml:space="preserve"> </w:t>
-      </w:r>
-      <w:r>
-        <w:t xml:space="preserve">levels of approximately 0.5 clo.</w:t>
+        <w:t xml:space="preserve">, wore summer clothing with exposed</w:t>
+      </w:r>
+      <w:r>
+        <w:t xml:space="preserve"> </w:t>
+      </w:r>
+      <w:r>
+        <w:t xml:space="preserve">ankles, resulting in clothing insulation levels of approximately 0.5</w:t>
+      </w:r>
+      <w:r>
+        <w:t xml:space="preserve"> </w:t>
+      </w:r>
+      <w:r>
+        <w:t xml:space="preserve">clo.</w:t>
       </w:r>
     </w:p>
     <w:p>
@@ -610,7 +670,7 @@
         <w:t xml:space="preserve"> </w:t>
       </w:r>
       <w:r>
-        <w:t xml:space="preserve">clothing insulation in office environments during heating seasons is</w:t>
+        <w:t xml:space="preserve">clothing insulation in commercial spaces during heating seasons is</w:t>
       </w:r>
       <w:r>
         <w:t xml:space="preserve"> </w:t>
@@ -634,13 +694,19 @@
         <w:t xml:space="preserve"> </w:t>
       </w:r>
       <w:r>
-        <w:t xml:space="preserve">calibrated for summer conditions with exposed skin, accurately predict</w:t>
-      </w:r>
-      <w:r>
-        <w:t xml:space="preserve"> </w:t>
-      </w:r>
-      <w:r>
-        <w:t xml:space="preserve">discomfort when ankles are covered by clothing?</w:t>
+        <w:t xml:space="preserve">calibrated for summer conditions where in about two thirds of test cases</w:t>
+      </w:r>
+      <w:r>
+        <w:t xml:space="preserve"> </w:t>
+      </w:r>
+      <w:r>
+        <w:t xml:space="preserve">subjects had exposed ankles, accurately predict discomfort when ankles</w:t>
+      </w:r>
+      <w:r>
+        <w:t xml:space="preserve"> </w:t>
+      </w:r>
+      <w:r>
+        <w:t xml:space="preserve">are covered by clothing?</w:t>
       </w:r>
     </w:p>
     <w:p>
@@ -660,43 +726,37 @@
         <w:t xml:space="preserve"> </w:t>
       </w:r>
       <w:r>
-        <w:t xml:space="preserve">specifying perimeter heating systems that are larger than necessary, or</w:t>
-      </w:r>
-      <w:r>
-        <w:t xml:space="preserve"> </w:t>
-      </w:r>
-      <w:r>
-        <w:t xml:space="preserve">installing them in situations where they could be avoided entirely. This</w:t>
-      </w:r>
-      <w:r>
-        <w:t xml:space="preserve"> </w:t>
-      </w:r>
-      <w:r>
-        <w:t xml:space="preserve">has consequences for both first costs and operational energy</w:t>
-      </w:r>
-      <w:r>
-        <w:t xml:space="preserve"> </w:t>
-      </w:r>
-      <w:r>
-        <w:t xml:space="preserve">consumption, as perimeter heating systems contribute to building energy</w:t>
-      </w:r>
-      <w:r>
-        <w:t xml:space="preserve"> </w:t>
-      </w:r>
-      <w:r>
-        <w:t xml:space="preserve">use and associated carbon emissions. Conversely, if the model</w:t>
-      </w:r>
-      <w:r>
-        <w:t xml:space="preserve"> </w:t>
-      </w:r>
-      <w:r>
-        <w:t xml:space="preserve">underestimates risk, occupants may experience discomfort that</w:t>
-      </w:r>
-      <w:r>
-        <w:t xml:space="preserve"> </w:t>
-      </w:r>
-      <w:r>
-        <w:t xml:space="preserve">compromises satisfaction and productivity.</w:t>
+        <w:t xml:space="preserve">specifying solutions, like perimeter heating systems, that are larger</w:t>
+      </w:r>
+      <w:r>
+        <w:t xml:space="preserve"> </w:t>
+      </w:r>
+      <w:r>
+        <w:t xml:space="preserve">than necessary, or installing them in situations where they could be</w:t>
+      </w:r>
+      <w:r>
+        <w:t xml:space="preserve"> </w:t>
+      </w:r>
+      <w:r>
+        <w:t xml:space="preserve">avoided entirely. This has consequences for both first costs and</w:t>
+      </w:r>
+      <w:r>
+        <w:t xml:space="preserve"> </w:t>
+      </w:r>
+      <w:r>
+        <w:t xml:space="preserve">operational energy consumption and related carbon emission. Conversely,</w:t>
+      </w:r>
+      <w:r>
+        <w:t xml:space="preserve"> </w:t>
+      </w:r>
+      <w:r>
+        <w:t xml:space="preserve">if the model underestimates risk, occupants may experience discomfort</w:t>
+      </w:r>
+      <w:r>
+        <w:t xml:space="preserve"> </w:t>
+      </w:r>
+      <w:r>
+        <w:t xml:space="preserve">that compromises satisfaction and performance.</w:t>
       </w:r>
     </w:p>
     <w:p>
@@ -716,55 +776,55 @@
         <w:t xml:space="preserve"> </w:t>
       </w:r>
       <w:r>
-        <w:t xml:space="preserve">controlled laboratory experiments. Specifically, we aim to: (1)</w:t>
-      </w:r>
-      <w:r>
-        <w:t xml:space="preserve"> </w:t>
-      </w:r>
-      <w:r>
-        <w:t xml:space="preserve">characterize whole-body and local thermal perception across a range of</w:t>
-      </w:r>
-      <w:r>
-        <w:t xml:space="preserve"> </w:t>
-      </w:r>
-      <w:r>
-        <w:t xml:space="preserve">supply air temperatures and air speeds representative of window</w:t>
-      </w:r>
-      <w:r>
-        <w:t xml:space="preserve"> </w:t>
-      </w:r>
-      <w:r>
-        <w:t xml:space="preserve">downdraft conditions; (2) compare observed dissatisfaction rates with</w:t>
-      </w:r>
-      <w:r>
-        <w:t xml:space="preserve"> </w:t>
-      </w:r>
-      <w:r>
-        <w:t xml:space="preserve">predictions from the existing ankle draft model; and (3) assess whether</w:t>
-      </w:r>
-      <w:r>
-        <w:t xml:space="preserve"> </w:t>
-      </w:r>
-      <w:r>
-        <w:t xml:space="preserve">the current ASHRAE 55 criteria require adjustment for winter scenarios.</w:t>
-      </w:r>
-      <w:r>
-        <w:t xml:space="preserve"> </w:t>
-      </w:r>
-      <w:r>
-        <w:t xml:space="preserve">The findings are intended to inform guidance on perimeter heating</w:t>
-      </w:r>
-      <w:r>
-        <w:t xml:space="preserve"> </w:t>
-      </w:r>
-      <w:r>
-        <w:t xml:space="preserve">requirements and support more energy-efficient building design without</w:t>
-      </w:r>
-      <w:r>
-        <w:t xml:space="preserve"> </w:t>
-      </w:r>
-      <w:r>
-        <w:t xml:space="preserve">compromising occupant comfort.</w:t>
+        <w:t xml:space="preserve">controlled laboratory experiments. We aim to: (1) characterize</w:t>
+      </w:r>
+      <w:r>
+        <w:t xml:space="preserve"> </w:t>
+      </w:r>
+      <w:r>
+        <w:t xml:space="preserve">whole-body and local thermal perception across a range of supply air</w:t>
+      </w:r>
+      <w:r>
+        <w:t xml:space="preserve"> </w:t>
+      </w:r>
+      <w:r>
+        <w:t xml:space="preserve">temperatures and air speeds representative of window downdraft</w:t>
+      </w:r>
+      <w:r>
+        <w:t xml:space="preserve"> </w:t>
+      </w:r>
+      <w:r>
+        <w:t xml:space="preserve">conditions; (2) compare observed dissatisfaction rates with predictions</w:t>
+      </w:r>
+      <w:r>
+        <w:t xml:space="preserve"> </w:t>
+      </w:r>
+      <w:r>
+        <w:t xml:space="preserve">from the existing ankle draft model; and (3) assess whether the current</w:t>
+      </w:r>
+      <w:r>
+        <w:t xml:space="preserve"> </w:t>
+      </w:r>
+      <w:r>
+        <w:t xml:space="preserve">ASHRAE 55 criteria require adjustment for winter scenarios. The findings</w:t>
+      </w:r>
+      <w:r>
+        <w:t xml:space="preserve"> </w:t>
+      </w:r>
+      <w:r>
+        <w:t xml:space="preserve">are intended to inform guidance on perimeter heating requirements and</w:t>
+      </w:r>
+      <w:r>
+        <w:t xml:space="preserve"> </w:t>
+      </w:r>
+      <w:r>
+        <w:t xml:space="preserve">support more energy-efficient building design without compromising</w:t>
+      </w:r>
+      <w:r>
+        <w:t xml:space="preserve"> </w:t>
+      </w:r>
+      <w:r>
+        <w:t xml:space="preserve">occupant comfort.</w:t>
       </w:r>
     </w:p>
     <w:bookmarkEnd w:id="22"/>
@@ -809,7 +869,7 @@
         <w:t xml:space="preserve"> </w:t>
       </w:r>
       <w:r>
-        <w:t xml:space="preserve">air temperature (SAT) at three levels (15°C, 17°C, 19°C) and air speed</w:t>
+        <w:t xml:space="preserve">air temperature (SAT) at three levels (15, 17, and 19°C) and air speed</w:t>
       </w:r>
       <w:r>
         <w:t xml:space="preserve"> </w:t>
@@ -833,13 +893,67 @@
         <w:t xml:space="preserve"> </w:t>
       </w:r>
       <w:r>
-        <w:t xml:space="preserve">winter conditions, informed by computational fluid dynamics simulations</w:t>
-      </w:r>
-      <w:r>
-        <w:t xml:space="preserve"> </w:t>
-      </w:r>
-      <w:r>
-        <w:t xml:space="preserve">conducted as part of a broader research collaboration.</w:t>
+        <w:t xml:space="preserve">winter conditions</w:t>
+      </w:r>
+      <w:r>
+        <w:t xml:space="preserve"> </w:t>
+      </w:r>
+      <w:r>
+        <w:t xml:space="preserve">(</w:t>
+      </w:r>
+      <w:hyperlink w:anchor="ref-manzAnalysisThermalComfort2004">
+        <w:r>
+          <w:rPr>
+            <w:rStyle w:val="Hyperlink"/>
+          </w:rPr>
+          <w:t xml:space="preserve">Manz &amp; Frank, 2004</w:t>
+        </w:r>
+      </w:hyperlink>
+      <w:r>
+        <w:t xml:space="preserve">)</w:t>
+      </w:r>
+      <w:r>
+        <w:t xml:space="preserve"> </w:t>
+      </w:r>
+      <w:r>
+        <w:t xml:space="preserve">and to be consistent</w:t>
+      </w:r>
+      <w:r>
+        <w:t xml:space="preserve"> </w:t>
+      </w:r>
+      <w:r>
+        <w:t xml:space="preserve">with earlier studies focusing on summer conditions</w:t>
+      </w:r>
+      <w:r>
+        <w:t xml:space="preserve"> </w:t>
+      </w:r>
+      <w:r>
+        <w:t xml:space="preserve">(</w:t>
+      </w:r>
+      <w:hyperlink w:anchor="X0e41857b9754d3f46055296e8711d0a459bcc8a">
+        <w:r>
+          <w:rPr>
+            <w:rStyle w:val="Hyperlink"/>
+          </w:rPr>
+          <w:t xml:space="preserve">Liu et al., 2017</w:t>
+        </w:r>
+      </w:hyperlink>
+      <w:r>
+        <w:t xml:space="preserve">;</w:t>
+      </w:r>
+      <w:r>
+        <w:t xml:space="preserve"> </w:t>
+      </w:r>
+      <w:hyperlink w:anchor="ref-schiavonSensationDraftUncovered2016">
+        <w:r>
+          <w:rPr>
+            <w:rStyle w:val="Hyperlink"/>
+          </w:rPr>
+          <w:t xml:space="preserve">Schiavon et al., 2016</w:t>
+        </w:r>
+      </w:hyperlink>
+      <w:r>
+        <w:t xml:space="preserve">)</w:t>
       </w:r>
     </w:p>
     <w:p>
@@ -907,7 +1021,7 @@
         <w:pStyle w:val="FirstParagraph"/>
       </w:pPr>
       <w:r>
-        <w:t xml:space="preserve">We conducted the experiment in a climate-controlled chamber at the</w:t>
+        <w:t xml:space="preserve">We conducted the experiment in the climate-controlled chamber at the</w:t>
       </w:r>
       <w:r>
         <w:t xml:space="preserve"> </w:t>
@@ -1000,7 +1114,7 @@
             <w:r>
               <w:drawing>
                 <wp:inline>
-                  <wp:extent cx="3212311" cy="4714932"/>
+                  <wp:extent cx="3212311" cy="3804197"/>
                   <wp:effectExtent b="0" l="0" r="0" t="0"/>
                   <wp:docPr descr="" title="" id="25" name="Picture"/>
                   <a:graphic>
@@ -1021,7 +1135,7 @@
                         <pic:spPr bwMode="auto">
                           <a:xfrm>
                             <a:off x="0" y="0"/>
-                            <a:ext cx="3212311" cy="4714932"/>
+                            <a:ext cx="3212311" cy="3804197"/>
                           </a:xfrm>
                           <a:prstGeom prst="rect">
                             <a:avLst/>
@@ -1056,7 +1170,7 @@
               <w:t xml:space="preserve"> </w:t>
             </w:r>
             <w:r>
-              <w:t xml:space="preserve">positioned 0.7 m from the custom displacement diffuser, which simulates</w:t>
+              <w:t xml:space="preserve">positioned 0.7 m from the custom displacement diffusor, which simulates</w:t>
             </w:r>
             <w:r>
               <w:t xml:space="preserve"> </w:t>
@@ -1098,61 +1212,61 @@
         <w:pStyle w:val="BodyText"/>
       </w:pPr>
       <w:r>
-        <w:t xml:space="preserve">We used custom displacement diffusers to deliver conditioned air to the</w:t>
-      </w:r>
-      <w:r>
-        <w:t xml:space="preserve"> </w:t>
-      </w:r>
-      <w:r>
-        <w:t xml:space="preserve">ankle region of participants seated at the three workstations. The</w:t>
-      </w:r>
-      <w:r>
-        <w:t xml:space="preserve"> </w:t>
-      </w:r>
-      <w:r>
-        <w:t xml:space="preserve">diffuser was positioned 0.7 m behind each workstation, directing airflow</w:t>
-      </w:r>
-      <w:r>
-        <w:t xml:space="preserve"> </w:t>
-      </w:r>
-      <w:r>
-        <w:t xml:space="preserve">toward the participants’ lower legs from behind and simulating the</w:t>
-      </w:r>
-      <w:r>
-        <w:t xml:space="preserve"> </w:t>
-      </w:r>
-      <w:r>
-        <w:t xml:space="preserve">approach direction of window downdraft. The diffuser was connected to an</w:t>
-      </w:r>
-      <w:r>
-        <w:t xml:space="preserve"> </w:t>
-      </w:r>
-      <w:r>
-        <w:t xml:space="preserve">independent air handling unit capable of delivering supply air at the</w:t>
-      </w:r>
-      <w:r>
-        <w:t xml:space="preserve"> </w:t>
-      </w:r>
-      <w:r>
-        <w:t xml:space="preserve">target temperatures and flow rates. The three supply air temperatures</w:t>
-      </w:r>
-      <w:r>
-        <w:t xml:space="preserve"> </w:t>
-      </w:r>
-      <w:r>
-        <w:t xml:space="preserve">(15°C, 17°C, 19°C) represent temperatures at the VAV outlet and we</w:t>
-      </w:r>
-      <w:r>
-        <w:t xml:space="preserve"> </w:t>
-      </w:r>
-      <w:r>
-        <w:t xml:space="preserve">controlled air flow rates by damper adjustment. Turbulence intensity at</w:t>
-      </w:r>
-      <w:r>
-        <w:t xml:space="preserve"> </w:t>
-      </w:r>
-      <w:r>
-        <w:t xml:space="preserve">the measurement location was approximately 30% (see</w:t>
+        <w:t xml:space="preserve">We used custom built displacement diffusors to deliver conditioned air</w:t>
+      </w:r>
+      <w:r>
+        <w:t xml:space="preserve"> </w:t>
+      </w:r>
+      <w:r>
+        <w:t xml:space="preserve">to the ankle region of participants seated at the three workstations.</w:t>
+      </w:r>
+      <w:r>
+        <w:t xml:space="preserve"> </w:t>
+      </w:r>
+      <w:r>
+        <w:t xml:space="preserve">The diffuser was positioned 0.7 m behind each workstation, directing</w:t>
+      </w:r>
+      <w:r>
+        <w:t xml:space="preserve"> </w:t>
+      </w:r>
+      <w:r>
+        <w:t xml:space="preserve">airflow toward the participants’ lower legs from behind and simulating</w:t>
+      </w:r>
+      <w:r>
+        <w:t xml:space="preserve"> </w:t>
+      </w:r>
+      <w:r>
+        <w:t xml:space="preserve">the approach direction of window downdraft. The diffuser was connected</w:t>
+      </w:r>
+      <w:r>
+        <w:t xml:space="preserve"> </w:t>
+      </w:r>
+      <w:r>
+        <w:t xml:space="preserve">to an independent air handling unit capable of delivering supply air at</w:t>
+      </w:r>
+      <w:r>
+        <w:t xml:space="preserve"> </w:t>
+      </w:r>
+      <w:r>
+        <w:t xml:space="preserve">the target temperatures and flow rates. The three supply air</w:t>
+      </w:r>
+      <w:r>
+        <w:t xml:space="preserve"> </w:t>
+      </w:r>
+      <w:r>
+        <w:t xml:space="preserve">temperatures represent temperatures at the VAV outlet and we controlled</w:t>
+      </w:r>
+      <w:r>
+        <w:t xml:space="preserve"> </w:t>
+      </w:r>
+      <w:r>
+        <w:t xml:space="preserve">air flow rates by damper adjustment. Turbulence intensity at the</w:t>
+      </w:r>
+      <w:r>
+        <w:t xml:space="preserve"> </w:t>
+      </w:r>
+      <w:r>
+        <w:t xml:space="preserve">measurement location was approximately 30% (see</w:t>
       </w:r>
       <w:r>
         <w:t xml:space="preserve"> </w:t>
@@ -1166,13 +1280,13 @@
         </w:r>
       </w:hyperlink>
       <w:r>
-        <w:t xml:space="preserve">),</w:t>
-      </w:r>
-      <w:r>
-        <w:t xml:space="preserve"> </w:t>
-      </w:r>
-      <w:r>
-        <w:t xml:space="preserve">consistent with values reported in prior ankle draft studies</w:t>
+        <w:t xml:space="preserve">), consistent</w:t>
+      </w:r>
+      <w:r>
+        <w:t xml:space="preserve"> </w:t>
+      </w:r>
+      <w:r>
+        <w:t xml:space="preserve">with values reported in prior ankle draft studies</w:t>
       </w:r>
       <w:r>
         <w:t xml:space="preserve"> </w:t>
@@ -1243,7 +1357,7 @@
         <w:t xml:space="preserve"> </w:t>
       </w:r>
       <w:r>
-        <w:t xml:space="preserve">temperature: -40 to +125°C, ± 0.5°C, relative humidity: 0 to 100%RH, ± 2</w:t>
+        <w:t xml:space="preserve">temperature: -40 to +125°C, ±0.5°C, relative humidity: 0 to 100%RH, ±2</w:t>
       </w:r>
       <w:r>
         <w:t xml:space="preserve"> </w:t>
@@ -1258,7 +1372,7 @@
         <w:t xml:space="preserve">2</w:t>
       </w:r>
       <w:r>
-        <w:t xml:space="preserve">: 0 to 5000 ppm, ± 50 ppm + 2.5% of reading at standard room</w:t>
+        <w:t xml:space="preserve">: 0 to 5000 ppm, ±50 ppm + 2.5% of reading at standard room</w:t>
       </w:r>
       <w:r>
         <w:t xml:space="preserve"> </w:t>
@@ -1294,7 +1408,7 @@
         <w:t xml:space="preserve"> </w:t>
       </w:r>
       <w:r>
-        <w:t xml:space="preserve">measurements of relative humidity and CO</w:t>
+        <w:t xml:space="preserve">measurements of CO</w:t>
       </w:r>
       <w:r>
         <w:rPr>
@@ -1306,13 +1420,28 @@
         <w:t xml:space="preserve"> </w:t>
       </w:r>
       <w:r>
-        <w:t xml:space="preserve">concentration were recorded</w:t>
-      </w:r>
-      <w:r>
-        <w:t xml:space="preserve"> </w:t>
-      </w:r>
-      <w:r>
-        <w:t xml:space="preserve">throughout each session.</w:t>
+        <w:t xml:space="preserve">concentration, PM</w:t>
+      </w:r>
+      <w:r>
+        <w:rPr>
+          <w:vertAlign w:val="subscript"/>
+        </w:rPr>
+        <w:t xml:space="preserve">2.5</w:t>
+      </w:r>
+      <w:r>
+        <w:t xml:space="preserve">, illuminance and sound</w:t>
+      </w:r>
+      <w:r>
+        <w:t xml:space="preserve"> </w:t>
+      </w:r>
+      <w:r>
+        <w:t xml:space="preserve">pressure levels were recorded throughout each session but not reported</w:t>
+      </w:r>
+      <w:r>
+        <w:t xml:space="preserve"> </w:t>
+      </w:r>
+      <w:r>
+        <w:t xml:space="preserve">here because they stayed constant and within expected ranges.</w:t>
       </w:r>
     </w:p>
     <w:bookmarkEnd w:id="29"/>
@@ -1477,8 +1606,9 @@
             <w:tblGrid>
               <w:gridCol w:w="1188"/>
               <w:gridCol w:w="1980"/>
+              <w:gridCol w:w="792"/>
               <w:gridCol w:w="1188"/>
-              <w:gridCol w:w="3564"/>
+              <w:gridCol w:w="2772"/>
             </w:tblGrid>
             <w:tr>
               <w:trPr>
@@ -1519,6 +1649,19 @@
                     <w:jc w:val="center"/>
                   </w:pPr>
                   <w:r>
+                    <w:t xml:space="preserve">Use</w:t>
+                  </w:r>
+                </w:p>
+              </w:tc>
+              <w:tc>
+                <w:tcPr/>
+                <w:p>
+                  <w:pPr>
+                    <w:pStyle w:val="Compact"/>
+                    <w:jc w:val="left"/>
+                    <w:jc w:val="center"/>
+                  </w:pPr>
+                  <w:r>
                     <w:t xml:space="preserve">Scale type</w:t>
                   </w:r>
                 </w:p>
@@ -1573,6 +1716,19 @@
                     <w:jc w:val="center"/>
                   </w:pPr>
                   <w:r>
+                    <w:t xml:space="preserve">F, P</w:t>
+                  </w:r>
+                </w:p>
+              </w:tc>
+              <w:tc>
+                <w:tcPr/>
+                <w:p>
+                  <w:pPr>
+                    <w:pStyle w:val="Compact"/>
+                    <w:jc w:val="left"/>
+                    <w:jc w:val="center"/>
+                  </w:pPr>
+                  <w:r>
                     <w:t xml:space="preserve">7-point continuous</w:t>
                   </w:r>
                 </w:p>
@@ -1627,6 +1783,19 @@
                     <w:jc w:val="center"/>
                   </w:pPr>
                   <w:r>
+                    <w:t xml:space="preserve">F, P</w:t>
+                  </w:r>
+                </w:p>
+              </w:tc>
+              <w:tc>
+                <w:tcPr/>
+                <w:p>
+                  <w:pPr>
+                    <w:pStyle w:val="Compact"/>
+                    <w:jc w:val="left"/>
+                    <w:jc w:val="center"/>
+                  </w:pPr>
+                  <w:r>
                     <w:t xml:space="preserve">6-point continuous</w:t>
                   </w:r>
                 </w:p>
@@ -1681,6 +1850,19 @@
                     <w:jc w:val="center"/>
                   </w:pPr>
                   <w:r>
+                    <w:t xml:space="preserve">F, P</w:t>
+                  </w:r>
+                </w:p>
+              </w:tc>
+              <w:tc>
+                <w:tcPr/>
+                <w:p>
+                  <w:pPr>
+                    <w:pStyle w:val="Compact"/>
+                    <w:jc w:val="left"/>
+                    <w:jc w:val="center"/>
+                  </w:pPr>
+                  <w:r>
                     <w:t xml:space="preserve">3-point ordinal</w:t>
                   </w:r>
                 </w:p>
@@ -1735,6 +1917,19 @@
                     <w:jc w:val="center"/>
                   </w:pPr>
                   <w:r>
+                    <w:t xml:space="preserve">F, P</w:t>
+                  </w:r>
+                </w:p>
+              </w:tc>
+              <w:tc>
+                <w:tcPr/>
+                <w:p>
+                  <w:pPr>
+                    <w:pStyle w:val="Compact"/>
+                    <w:jc w:val="left"/>
+                    <w:jc w:val="center"/>
+                  </w:pPr>
+                  <w:r>
                     <w:t xml:space="preserve">4-point continuous</w:t>
                   </w:r>
                 </w:p>
@@ -1789,6 +1984,19 @@
                     <w:jc w:val="center"/>
                   </w:pPr>
                   <w:r>
+                    <w:t xml:space="preserve">F</w:t>
+                  </w:r>
+                </w:p>
+              </w:tc>
+              <w:tc>
+                <w:tcPr/>
+                <w:p>
+                  <w:pPr>
+                    <w:pStyle w:val="Compact"/>
+                    <w:jc w:val="left"/>
+                    <w:jc w:val="center"/>
+                  </w:pPr>
+                  <w:r>
                     <w:t xml:space="preserve">4-point continuous</w:t>
                   </w:r>
                 </w:p>
@@ -1843,6 +2051,19 @@
                     <w:jc w:val="center"/>
                   </w:pPr>
                   <w:r>
+                    <w:t xml:space="preserve">F</w:t>
+                  </w:r>
+                </w:p>
+              </w:tc>
+              <w:tc>
+                <w:tcPr/>
+                <w:p>
+                  <w:pPr>
+                    <w:pStyle w:val="Compact"/>
+                    <w:jc w:val="left"/>
+                    <w:jc w:val="center"/>
+                  </w:pPr>
+                  <w:r>
                     <w:t xml:space="preserve">3-point ordinal</w:t>
                   </w:r>
                 </w:p>
@@ -1897,6 +2118,19 @@
                     <w:jc w:val="center"/>
                   </w:pPr>
                   <w:r>
+                    <w:t xml:space="preserve">F</w:t>
+                  </w:r>
+                </w:p>
+              </w:tc>
+              <w:tc>
+                <w:tcPr/>
+                <w:p>
+                  <w:pPr>
+                    <w:pStyle w:val="Compact"/>
+                    <w:jc w:val="left"/>
+                    <w:jc w:val="center"/>
+                  </w:pPr>
+                  <w:r>
                     <w:t xml:space="preserve">binary</w:t>
                   </w:r>
                 </w:p>
@@ -1910,7 +2144,7 @@
                     <w:jc w:val="center"/>
                   </w:pPr>
                   <w:r>
-                    <w:t xml:space="preserve">—</w:t>
+                    <w:t xml:space="preserve">Yes | No</w:t>
                   </w:r>
                 </w:p>
               </w:tc>
@@ -1985,13 +2219,25 @@
         <w:t xml:space="preserve"> </w:t>
       </w:r>
       <w:r>
-        <w:t xml:space="preserve">individuals were excluded. Demographic details of the cohort are</w:t>
-      </w:r>
-      <w:r>
-        <w:t xml:space="preserve"> </w:t>
-      </w:r>
-      <w:r>
-        <w:t xml:space="preserve">summarized in</w:t>
+        <w:t xml:space="preserve">individuals were excluded. The UC Berkeley Committee for Protection of</w:t>
+      </w:r>
+      <w:r>
+        <w:t xml:space="preserve"> </w:t>
+      </w:r>
+      <w:r>
+        <w:t xml:space="preserve">Human Subjects (CPHS) approved the research protocol (CPHS</w:t>
+      </w:r>
+      <w:r>
+        <w:t xml:space="preserve"> </w:t>
+      </w:r>
+      <w:r>
+        <w:t xml:space="preserve">##2025-07-18795). Before the tests, all subjects signed an informed</w:t>
+      </w:r>
+      <w:r>
+        <w:t xml:space="preserve"> </w:t>
+      </w:r>
+      <w:r>
+        <w:t xml:space="preserve">consent form. Demographic details of the cohort are summarized in</w:t>
       </w:r>
       <w:r>
         <w:t xml:space="preserve"> </w:t>
@@ -2049,31 +2295,31 @@
         <w:pStyle w:val="BodyText"/>
       </w:pPr>
       <w:r>
-        <w:t xml:space="preserve">To simulate typical winter office attire, we instructed participants to</w:t>
-      </w:r>
-      <w:r>
-        <w:t xml:space="preserve"> </w:t>
-      </w:r>
-      <w:r>
-        <w:t xml:space="preserve">wear a long-sleeve top, long trousers (ending just above the ankle),</w:t>
-      </w:r>
-      <w:r>
-        <w:t xml:space="preserve"> </w:t>
-      </w:r>
-      <w:r>
-        <w:t xml:space="preserve">thin socks, and closed-toe shoes. This ensemble targets a clothing</w:t>
-      </w:r>
-      <w:r>
-        <w:t xml:space="preserve"> </w:t>
-      </w:r>
-      <w:r>
-        <w:t xml:space="preserve">insulation of approximately 0.75 clo, consistent with the median value</w:t>
-      </w:r>
-      <w:r>
-        <w:t xml:space="preserve"> </w:t>
-      </w:r>
-      <w:r>
-        <w:t xml:space="preserve">observed in office buildings during heating seasons</w:t>
+        <w:t xml:space="preserve">To simulate typical winter attire, we instructed participants to wear a</w:t>
+      </w:r>
+      <w:r>
+        <w:t xml:space="preserve"> </w:t>
+      </w:r>
+      <w:r>
+        <w:t xml:space="preserve">long-sleeve top, long trousers (ending just above the ankle), thin</w:t>
+      </w:r>
+      <w:r>
+        <w:t xml:space="preserve"> </w:t>
+      </w:r>
+      <w:r>
+        <w:t xml:space="preserve">socks, and closed-toe shoes. This ensemble targets a clothing insulation</w:t>
+      </w:r>
+      <w:r>
+        <w:t xml:space="preserve"> </w:t>
+      </w:r>
+      <w:r>
+        <w:t xml:space="preserve">of approximately 0.75 clo, consistent with the median value observed in</w:t>
+      </w:r>
+      <w:r>
+        <w:t xml:space="preserve"> </w:t>
+      </w:r>
+      <w:r>
+        <w:t xml:space="preserve">commercial buildings during heating seasons</w:t>
       </w:r>
       <w:r>
         <w:t xml:space="preserve"> </w:t>
@@ -2125,25 +2371,39 @@
         <w:t xml:space="preserve"> </w:t>
       </w:r>
       <w:r>
-        <w:t xml:space="preserve">periods between conditions (see PROTOCOL GRAPHIC REFERENCE). The</w:t>
-      </w:r>
-      <w:r>
-        <w:t xml:space="preserve"> </w:t>
-      </w:r>
-      <w:r>
-        <w:t xml:space="preserve">sequence of air speed conditions was counterbalanced across participants</w:t>
-      </w:r>
-      <w:r>
-        <w:t xml:space="preserve"> </w:t>
-      </w:r>
-      <w:r>
-        <w:t xml:space="preserve">and sessions. During each exposure period, participants completed</w:t>
-      </w:r>
-      <w:r>
-        <w:t xml:space="preserve"> </w:t>
-      </w:r>
-      <w:r>
-        <w:t xml:space="preserve">standardized questionnaires at the end of each interval.</w:t>
+        <w:t xml:space="preserve">periods between conditions (see</w:t>
+      </w:r>
+      <w:r>
+        <w:t xml:space="preserve"> </w:t>
+      </w:r>
+      <w:hyperlink w:anchor="fig-setup">
+        <w:r>
+          <w:rPr>
+            <w:rStyle w:val="Hyperlink"/>
+          </w:rPr>
+          <w:t xml:space="preserve">Figure 1</w:t>
+        </w:r>
+      </w:hyperlink>
+      <w:r>
+        <w:t xml:space="preserve">). The sequence of air speed</w:t>
+      </w:r>
+      <w:r>
+        <w:t xml:space="preserve"> </w:t>
+      </w:r>
+      <w:r>
+        <w:t xml:space="preserve">conditions was counterbalanced across participants and sessions. During</w:t>
+      </w:r>
+      <w:r>
+        <w:t xml:space="preserve"> </w:t>
+      </w:r>
+      <w:r>
+        <w:t xml:space="preserve">each exposure period, participants completed standardized questionnaires</w:t>
+      </w:r>
+      <w:r>
+        <w:t xml:space="preserve"> </w:t>
+      </w:r>
+      <w:r>
+        <w:t xml:space="preserve">at the end of each interval.</w:t>
       </w:r>
     </w:p>
     <w:bookmarkEnd w:id="35"/>
@@ -2680,13 +2940,13 @@
     </w:p>
     <w:bookmarkEnd w:id="39"/>
     <w:bookmarkEnd w:id="40"/>
-    <w:bookmarkStart w:id="41" w:name="software"/>
+    <w:bookmarkStart w:id="41" w:name="software-and-data"/>
     <w:p>
       <w:pPr>
         <w:pStyle w:val="Heading2"/>
       </w:pPr>
       <w:r>
-        <w:t xml:space="preserve">2.7 Software</w:t>
+        <w:t xml:space="preserve">2.7 Software and data</w:t>
       </w:r>
     </w:p>
     <w:p>
@@ -2712,7 +2972,13 @@
         <w:t xml:space="preserve"> </w:t>
       </w:r>
       <w:r>
-        <w:t xml:space="preserve">CalibrationCurves (version 3.0.0).</w:t>
+        <w:t xml:space="preserve">CalibrationCurves (version 3.0.0). Data and analysis code are available</w:t>
+      </w:r>
+      <w:r>
+        <w:t xml:space="preserve"> </w:t>
+      </w:r>
+      <w:r>
+        <w:t xml:space="preserve">on: https://github.com/CenterForTheBuiltEnvironment/ankle-draft-II</w:t>
       </w:r>
     </w:p>
     <w:bookmarkEnd w:id="41"/>
@@ -2759,7 +3025,7 @@
               <w:pStyle w:val="ImageCaption"/>
             </w:pPr>
             <w:r>
-              <w:t xml:space="preserve">Table 2: Summary of demographic information (mean ± SD) on study participants.</w:t>
+              <w:t xml:space="preserve">Table 2: Summary of demographic information (median [IQR]) on study participants.</w:t>
             </w:r>
           </w:p>
           <w:tbl>
@@ -2770,12 +3036,12 @@
               <w:tblLook w:firstRow="1" w:lastRow="0" w:firstColumn="0" w:lastColumn="0" w:noHBand="0" w:noVBand="0" w:val="0020"/>
             </w:tblPr>
             <w:tblGrid>
-              <w:gridCol w:w="1614"/>
-              <w:gridCol w:w="999"/>
-              <w:gridCol w:w="1153"/>
-              <w:gridCol w:w="1230"/>
-              <w:gridCol w:w="1230"/>
-              <w:gridCol w:w="1691"/>
+              <w:gridCol w:w="1512"/>
+              <w:gridCol w:w="936"/>
+              <w:gridCol w:w="1296"/>
+              <w:gridCol w:w="1296"/>
+              <w:gridCol w:w="1296"/>
+              <w:gridCol w:w="1584"/>
             </w:tblGrid>
             <w:tr>
               <w:trPr>
@@ -2896,46 +3162,46 @@
                     <w:jc w:val="center"/>
                   </w:pPr>
                   <w:r>
-                    <w:t xml:space="preserve">23.5 (+/- 5.9)</w:t>
-                  </w:r>
-                </w:p>
-              </w:tc>
-              <w:tc>
-                <w:tcPr/>
-                <w:p>
-                  <w:pPr>
-                    <w:pStyle w:val="Compact"/>
-                    <w:jc w:val="left"/>
-                    <w:jc w:val="center"/>
-                  </w:pPr>
-                  <w:r>
-                    <w:t xml:space="preserve">1.70 (+/- 0.10)</w:t>
-                  </w:r>
-                </w:p>
-              </w:tc>
-              <w:tc>
-                <w:tcPr/>
-                <w:p>
-                  <w:pPr>
-                    <w:pStyle w:val="Compact"/>
-                    <w:jc w:val="left"/>
-                    <w:jc w:val="center"/>
-                  </w:pPr>
-                  <w:r>
-                    <w:t xml:space="preserve">69.0 (+/- 11.8)</w:t>
-                  </w:r>
-                </w:p>
-              </w:tc>
-              <w:tc>
-                <w:tcPr/>
-                <w:p>
-                  <w:pPr>
-                    <w:pStyle w:val="Compact"/>
-                    <w:jc w:val="left"/>
-                    <w:jc w:val="center"/>
-                  </w:pPr>
-                  <w:r>
-                    <w:t xml:space="preserve">23.9 (+/- 4.1)</w:t>
+                    <w:t xml:space="preserve">22.0 [21.0, 24.0]</w:t>
+                  </w:r>
+                </w:p>
+              </w:tc>
+              <w:tc>
+                <w:tcPr/>
+                <w:p>
+                  <w:pPr>
+                    <w:pStyle w:val="Compact"/>
+                    <w:jc w:val="left"/>
+                    <w:jc w:val="center"/>
+                  </w:pPr>
+                  <w:r>
+                    <w:t xml:space="preserve">1.68 [1.64, 1.75]</w:t>
+                  </w:r>
+                </w:p>
+              </w:tc>
+              <w:tc>
+                <w:tcPr/>
+                <w:p>
+                  <w:pPr>
+                    <w:pStyle w:val="Compact"/>
+                    <w:jc w:val="left"/>
+                    <w:jc w:val="center"/>
+                  </w:pPr>
+                  <w:r>
+                    <w:t xml:space="preserve">68.0 [61.0, 75.0]</w:t>
+                  </w:r>
+                </w:p>
+              </w:tc>
+              <w:tc>
+                <w:tcPr/>
+                <w:p>
+                  <w:pPr>
+                    <w:pStyle w:val="Compact"/>
+                    <w:jc w:val="left"/>
+                    <w:jc w:val="center"/>
+                  </w:pPr>
+                  <w:r>
+                    <w:t xml:space="preserve">23.3 [21.4, 25.6]</w:t>
                   </w:r>
                 </w:p>
               </w:tc>
@@ -2976,46 +3242,46 @@
                     <w:jc w:val="center"/>
                   </w:pPr>
                   <w:r>
-                    <w:t xml:space="preserve">23.5 (+/- 6.4)</w:t>
-                  </w:r>
-                </w:p>
-              </w:tc>
-              <w:tc>
-                <w:tcPr/>
-                <w:p>
-                  <w:pPr>
-                    <w:pStyle w:val="Compact"/>
-                    <w:jc w:val="left"/>
-                    <w:jc w:val="center"/>
-                  </w:pPr>
-                  <w:r>
-                    <w:t xml:space="preserve">1.65 (+/- 0.06)</w:t>
-                  </w:r>
-                </w:p>
-              </w:tc>
-              <w:tc>
-                <w:tcPr/>
-                <w:p>
-                  <w:pPr>
-                    <w:pStyle w:val="Compact"/>
-                    <w:jc w:val="left"/>
-                    <w:jc w:val="center"/>
-                  </w:pPr>
-                  <w:r>
-                    <w:t xml:space="preserve">65.6 (+/- 11.5)</w:t>
-                  </w:r>
-                </w:p>
-              </w:tc>
-              <w:tc>
-                <w:tcPr/>
-                <w:p>
-                  <w:pPr>
-                    <w:pStyle w:val="Compact"/>
-                    <w:jc w:val="left"/>
-                    <w:jc w:val="center"/>
-                  </w:pPr>
-                  <w:r>
-                    <w:t xml:space="preserve">24.3 (+/- 4.7)</w:t>
+                    <w:t xml:space="preserve">22.5 [21.0, 25.2]</w:t>
+                  </w:r>
+                </w:p>
+              </w:tc>
+              <w:tc>
+                <w:tcPr/>
+                <w:p>
+                  <w:pPr>
+                    <w:pStyle w:val="Compact"/>
+                    <w:jc w:val="left"/>
+                    <w:jc w:val="center"/>
+                  </w:pPr>
+                  <w:r>
+                    <w:t xml:space="preserve">1.65 [1.63, 1.68]</w:t>
+                  </w:r>
+                </w:p>
+              </w:tc>
+              <w:tc>
+                <w:tcPr/>
+                <w:p>
+                  <w:pPr>
+                    <w:pStyle w:val="Compact"/>
+                    <w:jc w:val="left"/>
+                    <w:jc w:val="center"/>
+                  </w:pPr>
+                  <w:r>
+                    <w:t xml:space="preserve">64.5 [58.8, 72.2]</w:t>
+                  </w:r>
+                </w:p>
+              </w:tc>
+              <w:tc>
+                <w:tcPr/>
+                <w:p>
+                  <w:pPr>
+                    <w:pStyle w:val="Compact"/>
+                    <w:jc w:val="left"/>
+                    <w:jc w:val="center"/>
+                  </w:pPr>
+                  <w:r>
+                    <w:t xml:space="preserve">23.0 [21.3, 26.0]</w:t>
                   </w:r>
                 </w:p>
               </w:tc>
@@ -3056,46 +3322,46 @@
                     <w:jc w:val="center"/>
                   </w:pPr>
                   <w:r>
-                    <w:t xml:space="preserve">23.9 (+/- 5.6)</w:t>
-                  </w:r>
-                </w:p>
-              </w:tc>
-              <w:tc>
-                <w:tcPr/>
-                <w:p>
-                  <w:pPr>
-                    <w:pStyle w:val="Compact"/>
-                    <w:jc w:val="left"/>
-                    <w:jc w:val="center"/>
-                  </w:pPr>
-                  <w:r>
-                    <w:t xml:space="preserve">1.79 (+/- 0.09)</w:t>
-                  </w:r>
-                </w:p>
-              </w:tc>
-              <w:tc>
-                <w:tcPr/>
-                <w:p>
-                  <w:pPr>
-                    <w:pStyle w:val="Compact"/>
-                    <w:jc w:val="left"/>
-                    <w:jc w:val="center"/>
-                  </w:pPr>
-                  <w:r>
-                    <w:t xml:space="preserve">74.8 (+/- 9.6)</w:t>
-                  </w:r>
-                </w:p>
-              </w:tc>
-              <w:tc>
-                <w:tcPr/>
-                <w:p>
-                  <w:pPr>
-                    <w:pStyle w:val="Compact"/>
-                    <w:jc w:val="left"/>
-                    <w:jc w:val="center"/>
-                  </w:pPr>
-                  <w:r>
-                    <w:t xml:space="preserve">23.4 (+/- 3.0)</w:t>
+                    <w:t xml:space="preserve">22.0 [21.0, 22.5]</w:t>
+                  </w:r>
+                </w:p>
+              </w:tc>
+              <w:tc>
+                <w:tcPr/>
+                <w:p>
+                  <w:pPr>
+                    <w:pStyle w:val="Compact"/>
+                    <w:jc w:val="left"/>
+                    <w:jc w:val="center"/>
+                  </w:pPr>
+                  <w:r>
+                    <w:t xml:space="preserve">1.79 [1.75, 1.83]</w:t>
+                  </w:r>
+                </w:p>
+              </w:tc>
+              <w:tc>
+                <w:tcPr/>
+                <w:p>
+                  <w:pPr>
+                    <w:pStyle w:val="Compact"/>
+                    <w:jc w:val="left"/>
+                    <w:jc w:val="center"/>
+                  </w:pPr>
+                  <w:r>
+                    <w:t xml:space="preserve">72.5 [66.0, 84.2]</w:t>
+                  </w:r>
+                </w:p>
+              </w:tc>
+              <w:tc>
+                <w:tcPr/>
+                <w:p>
+                  <w:pPr>
+                    <w:pStyle w:val="Compact"/>
+                    <w:jc w:val="left"/>
+                    <w:jc w:val="center"/>
+                  </w:pPr>
+                  <w:r>
+                    <w:t xml:space="preserve">23.4 [21.5, 24.8]</w:t>
                   </w:r>
                 </w:p>
               </w:tc>
@@ -3136,46 +3402,46 @@
                     <w:jc w:val="center"/>
                   </w:pPr>
                   <w:r>
-                    <w:t xml:space="preserve">22.0 (+/- 1.0)</w:t>
-                  </w:r>
-                </w:p>
-              </w:tc>
-              <w:tc>
-                <w:tcPr/>
-                <w:p>
-                  <w:pPr>
-                    <w:pStyle w:val="Compact"/>
-                    <w:jc w:val="left"/>
-                    <w:jc w:val="center"/>
-                  </w:pPr>
-                  <w:r>
-                    <w:t xml:space="preserve">1.61 (+/- 0.02)</w:t>
-                  </w:r>
-                </w:p>
-              </w:tc>
-              <w:tc>
-                <w:tcPr/>
-                <w:p>
-                  <w:pPr>
-                    <w:pStyle w:val="Compact"/>
-                    <w:jc w:val="left"/>
-                    <w:jc w:val="center"/>
-                  </w:pPr>
-                  <w:r>
-                    <w:t xml:space="preserve">62.0 (+/- 14.9)</w:t>
-                  </w:r>
-                </w:p>
-              </w:tc>
-              <w:tc>
-                <w:tcPr/>
-                <w:p>
-                  <w:pPr>
-                    <w:pStyle w:val="Compact"/>
-                    <w:jc w:val="left"/>
-                    <w:jc w:val="center"/>
-                  </w:pPr>
-                  <w:r>
-                    <w:t xml:space="preserve">23.9 (+/- 5.7)</w:t>
+                    <w:t xml:space="preserve">22.0 [21.5, 22.5]</w:t>
+                  </w:r>
+                </w:p>
+              </w:tc>
+              <w:tc>
+                <w:tcPr/>
+                <w:p>
+                  <w:pPr>
+                    <w:pStyle w:val="Compact"/>
+                    <w:jc w:val="left"/>
+                    <w:jc w:val="center"/>
+                  </w:pPr>
+                  <w:r>
+                    <w:t xml:space="preserve">1.60 [1.60, 1.61]</w:t>
+                  </w:r>
+                </w:p>
+              </w:tc>
+              <w:tc>
+                <w:tcPr/>
+                <w:p>
+                  <w:pPr>
+                    <w:pStyle w:val="Compact"/>
+                    <w:jc w:val="left"/>
+                    <w:jc w:val="center"/>
+                  </w:pPr>
+                  <w:r>
+                    <w:t xml:space="preserve">68.0 [56.5, 70.5]</w:t>
+                  </w:r>
+                </w:p>
+              </w:tc>
+              <w:tc>
+                <w:tcPr/>
+                <w:p>
+                  <w:pPr>
+                    <w:pStyle w:val="Compact"/>
+                    <w:jc w:val="left"/>
+                    <w:jc w:val="center"/>
+                  </w:pPr>
+                  <w:r>
+                    <w:t xml:space="preserve">25.6 [21.6, 27.1]</w:t>
                   </w:r>
                 </w:p>
               </w:tc>
@@ -3256,13 +3522,13 @@
         <w:t xml:space="preserve"> </w:t>
       </w:r>
       <w:r>
-        <w:t xml:space="preserve">other), with a mean age of</w:t>
-      </w:r>
-      <w:r>
-        <w:t xml:space="preserve"> </w:t>
-      </w:r>
-      <w:r>
-        <w:t xml:space="preserve">23.5 (+/- 5.9)</w:t>
+        <w:t xml:space="preserve">other), with a median age of</w:t>
+      </w:r>
+      <w:r>
+        <w:t xml:space="preserve"> </w:t>
+      </w:r>
+      <w:r>
+        <w:t xml:space="preserve">22.0 [21.0, 24.0]</w:t>
       </w:r>
       <w:r>
         <w:t xml:space="preserve"> </w:t>
@@ -3306,10 +3572,10 @@
               <w:tblLook w:firstRow="1" w:lastRow="0" w:firstColumn="0" w:lastColumn="0" w:noHBand="0" w:noVBand="0" w:val="0020"/>
             </w:tblPr>
             <w:tblGrid>
-              <w:gridCol w:w="3168"/>
-              <w:gridCol w:w="1584"/>
-              <w:gridCol w:w="1584"/>
-              <w:gridCol w:w="1584"/>
+              <w:gridCol w:w="3408"/>
+              <w:gridCol w:w="1503"/>
+              <w:gridCol w:w="1503"/>
+              <w:gridCol w:w="1503"/>
             </w:tblGrid>
             <w:tr>
               <w:trPr>
@@ -3337,33 +3603,33 @@
                     <w:jc w:val="center"/>
                   </w:pPr>
                   <w:r>
-                    <w:t xml:space="preserve">15C</w:t>
-                  </w:r>
-                </w:p>
-              </w:tc>
-              <w:tc>
-                <w:tcPr/>
-                <w:p>
-                  <w:pPr>
-                    <w:pStyle w:val="Compact"/>
-                    <w:jc w:val="left"/>
-                    <w:jc w:val="center"/>
-                  </w:pPr>
-                  <w:r>
-                    <w:t xml:space="preserve">17C</w:t>
-                  </w:r>
-                </w:p>
-              </w:tc>
-              <w:tc>
-                <w:tcPr/>
-                <w:p>
-                  <w:pPr>
-                    <w:pStyle w:val="Compact"/>
-                    <w:jc w:val="left"/>
-                    <w:jc w:val="center"/>
-                  </w:pPr>
-                  <w:r>
-                    <w:t xml:space="preserve">19C</w:t>
+                    <w:t xml:space="preserve">15°C</w:t>
+                  </w:r>
+                </w:p>
+              </w:tc>
+              <w:tc>
+                <w:tcPr/>
+                <w:p>
+                  <w:pPr>
+                    <w:pStyle w:val="Compact"/>
+                    <w:jc w:val="left"/>
+                    <w:jc w:val="center"/>
+                  </w:pPr>
+                  <w:r>
+                    <w:t xml:space="preserve">17°C</w:t>
+                  </w:r>
+                </w:p>
+              </w:tc>
+              <w:tc>
+                <w:tcPr/>
+                <w:p>
+                  <w:pPr>
+                    <w:pStyle w:val="Compact"/>
+                    <w:jc w:val="left"/>
+                    <w:jc w:val="center"/>
+                  </w:pPr>
+                  <w:r>
+                    <w:t xml:space="preserve">19°C</w:t>
                   </w:r>
                 </w:p>
               </w:tc>
@@ -3391,33 +3657,33 @@
                     <w:jc w:val="center"/>
                   </w:pPr>
                   <w:r>
-                    <w:t xml:space="preserve">21.9 ( +/- 0.2)</w:t>
-                  </w:r>
-                </w:p>
-              </w:tc>
-              <w:tc>
-                <w:tcPr/>
-                <w:p>
-                  <w:pPr>
-                    <w:pStyle w:val="Compact"/>
-                    <w:jc w:val="left"/>
-                    <w:jc w:val="center"/>
-                  </w:pPr>
-                  <w:r>
-                    <w:t xml:space="preserve">21.9 ( +/- 0.3)</w:t>
-                  </w:r>
-                </w:p>
-              </w:tc>
-              <w:tc>
-                <w:tcPr/>
-                <w:p>
-                  <w:pPr>
-                    <w:pStyle w:val="Compact"/>
-                    <w:jc w:val="left"/>
-                    <w:jc w:val="center"/>
-                  </w:pPr>
-                  <w:r>
-                    <w:t xml:space="preserve">21.9 ( +/- 0.2)</w:t>
+                    <w:t xml:space="preserve">21.9 ( ± 0.2)</w:t>
+                  </w:r>
+                </w:p>
+              </w:tc>
+              <w:tc>
+                <w:tcPr/>
+                <w:p>
+                  <w:pPr>
+                    <w:pStyle w:val="Compact"/>
+                    <w:jc w:val="left"/>
+                    <w:jc w:val="center"/>
+                  </w:pPr>
+                  <w:r>
+                    <w:t xml:space="preserve">21.9 ( ± 0.3)</w:t>
+                  </w:r>
+                </w:p>
+              </w:tc>
+              <w:tc>
+                <w:tcPr/>
+                <w:p>
+                  <w:pPr>
+                    <w:pStyle w:val="Compact"/>
+                    <w:jc w:val="left"/>
+                    <w:jc w:val="center"/>
+                  </w:pPr>
+                  <w:r>
+                    <w:t xml:space="preserve">21.9 ( ± 0.2)</w:t>
                   </w:r>
                 </w:p>
               </w:tc>
@@ -3445,33 +3711,33 @@
                     <w:jc w:val="center"/>
                   </w:pPr>
                   <w:r>
-                    <w:t xml:space="preserve">54.9 ( +/- 5.5)</w:t>
-                  </w:r>
-                </w:p>
-              </w:tc>
-              <w:tc>
-                <w:tcPr/>
-                <w:p>
-                  <w:pPr>
-                    <w:pStyle w:val="Compact"/>
-                    <w:jc w:val="left"/>
-                    <w:jc w:val="center"/>
-                  </w:pPr>
-                  <w:r>
-                    <w:t xml:space="preserve">52.3 ( +/- 5)</w:t>
-                  </w:r>
-                </w:p>
-              </w:tc>
-              <w:tc>
-                <w:tcPr/>
-                <w:p>
-                  <w:pPr>
-                    <w:pStyle w:val="Compact"/>
-                    <w:jc w:val="left"/>
-                    <w:jc w:val="center"/>
-                  </w:pPr>
-                  <w:r>
-                    <w:t xml:space="preserve">51.2 ( +/- 4.8)</w:t>
+                    <w:t xml:space="preserve">54.9 ( ± 5.5)</w:t>
+                  </w:r>
+                </w:p>
+              </w:tc>
+              <w:tc>
+                <w:tcPr/>
+                <w:p>
+                  <w:pPr>
+                    <w:pStyle w:val="Compact"/>
+                    <w:jc w:val="left"/>
+                    <w:jc w:val="center"/>
+                  </w:pPr>
+                  <w:r>
+                    <w:t xml:space="preserve">52.3 ( ± 5)</w:t>
+                  </w:r>
+                </w:p>
+              </w:tc>
+              <w:tc>
+                <w:tcPr/>
+                <w:p>
+                  <w:pPr>
+                    <w:pStyle w:val="Compact"/>
+                    <w:jc w:val="left"/>
+                    <w:jc w:val="center"/>
+                  </w:pPr>
+                  <w:r>
+                    <w:t xml:space="preserve">51.2 ( ± 4.8)</w:t>
                   </w:r>
                 </w:p>
               </w:tc>
@@ -3499,33 +3765,33 @@
                     <w:jc w:val="center"/>
                   </w:pPr>
                   <w:r>
-                    <w:t xml:space="preserve">17.6 ( +/- 0.2)</w:t>
-                  </w:r>
-                </w:p>
-              </w:tc>
-              <w:tc>
-                <w:tcPr/>
-                <w:p>
-                  <w:pPr>
-                    <w:pStyle w:val="Compact"/>
-                    <w:jc w:val="left"/>
-                    <w:jc w:val="center"/>
-                  </w:pPr>
-                  <w:r>
-                    <w:t xml:space="preserve">18.3 ( +/- 0.2)</w:t>
-                  </w:r>
-                </w:p>
-              </w:tc>
-              <w:tc>
-                <w:tcPr/>
-                <w:p>
-                  <w:pPr>
-                    <w:pStyle w:val="Compact"/>
-                    <w:jc w:val="left"/>
-                    <w:jc w:val="center"/>
-                  </w:pPr>
-                  <w:r>
-                    <w:t xml:space="preserve">19.7 ( +/- 0.2)</w:t>
+                    <w:t xml:space="preserve">17.6 ( ± 0.2)</w:t>
+                  </w:r>
+                </w:p>
+              </w:tc>
+              <w:tc>
+                <w:tcPr/>
+                <w:p>
+                  <w:pPr>
+                    <w:pStyle w:val="Compact"/>
+                    <w:jc w:val="left"/>
+                    <w:jc w:val="center"/>
+                  </w:pPr>
+                  <w:r>
+                    <w:t xml:space="preserve">18.3 ( ± 0.2)</w:t>
+                  </w:r>
+                </w:p>
+              </w:tc>
+              <w:tc>
+                <w:tcPr/>
+                <w:p>
+                  <w:pPr>
+                    <w:pStyle w:val="Compact"/>
+                    <w:jc w:val="left"/>
+                    <w:jc w:val="center"/>
+                  </w:pPr>
+                  <w:r>
+                    <w:t xml:space="preserve">19.7 ( ± 0.2)</w:t>
                   </w:r>
                 </w:p>
               </w:tc>
@@ -3553,33 +3819,33 @@
                     <w:jc w:val="center"/>
                   </w:pPr>
                   <w:r>
-                    <w:t xml:space="preserve">0.14 ( +/- 0.02)</w:t>
-                  </w:r>
-                </w:p>
-              </w:tc>
-              <w:tc>
-                <w:tcPr/>
-                <w:p>
-                  <w:pPr>
-                    <w:pStyle w:val="Compact"/>
-                    <w:jc w:val="left"/>
-                    <w:jc w:val="center"/>
-                  </w:pPr>
-                  <w:r>
-                    <w:t xml:space="preserve">0.16 ( +/- 0.01)</w:t>
-                  </w:r>
-                </w:p>
-              </w:tc>
-              <w:tc>
-                <w:tcPr/>
-                <w:p>
-                  <w:pPr>
-                    <w:pStyle w:val="Compact"/>
-                    <w:jc w:val="left"/>
-                    <w:jc w:val="center"/>
-                  </w:pPr>
-                  <w:r>
-                    <w:t xml:space="preserve">0.18 ( +/- 0.01)</w:t>
+                    <w:t xml:space="preserve">0.14 ( ± 0.02)</w:t>
+                  </w:r>
+                </w:p>
+              </w:tc>
+              <w:tc>
+                <w:tcPr/>
+                <w:p>
+                  <w:pPr>
+                    <w:pStyle w:val="Compact"/>
+                    <w:jc w:val="left"/>
+                    <w:jc w:val="center"/>
+                  </w:pPr>
+                  <w:r>
+                    <w:t xml:space="preserve">0.16 ( ± 0.01)</w:t>
+                  </w:r>
+                </w:p>
+              </w:tc>
+              <w:tc>
+                <w:tcPr/>
+                <w:p>
+                  <w:pPr>
+                    <w:pStyle w:val="Compact"/>
+                    <w:jc w:val="left"/>
+                    <w:jc w:val="center"/>
+                  </w:pPr>
+                  <w:r>
+                    <w:t xml:space="preserve">0.18 ( ± 0.01)</w:t>
                   </w:r>
                 </w:p>
               </w:tc>
@@ -3607,33 +3873,33 @@
                     <w:jc w:val="center"/>
                   </w:pPr>
                   <w:r>
-                    <w:t xml:space="preserve">0.37 ( +/- 0.02)</w:t>
-                  </w:r>
-                </w:p>
-              </w:tc>
-              <w:tc>
-                <w:tcPr/>
-                <w:p>
-                  <w:pPr>
-                    <w:pStyle w:val="Compact"/>
-                    <w:jc w:val="left"/>
-                    <w:jc w:val="center"/>
-                  </w:pPr>
-                  <w:r>
-                    <w:t xml:space="preserve">0.39 ( +/- 0.03)</w:t>
-                  </w:r>
-                </w:p>
-              </w:tc>
-              <w:tc>
-                <w:tcPr/>
-                <w:p>
-                  <w:pPr>
-                    <w:pStyle w:val="Compact"/>
-                    <w:jc w:val="left"/>
-                    <w:jc w:val="center"/>
-                  </w:pPr>
-                  <w:r>
-                    <w:t xml:space="preserve">0.42 ( +/- 0.03)</w:t>
+                    <w:t xml:space="preserve">0.37 ( ± 0.02)</w:t>
+                  </w:r>
+                </w:p>
+              </w:tc>
+              <w:tc>
+                <w:tcPr/>
+                <w:p>
+                  <w:pPr>
+                    <w:pStyle w:val="Compact"/>
+                    <w:jc w:val="left"/>
+                    <w:jc w:val="center"/>
+                  </w:pPr>
+                  <w:r>
+                    <w:t xml:space="preserve">0.39 ( ± 0.03)</w:t>
+                  </w:r>
+                </w:p>
+              </w:tc>
+              <w:tc>
+                <w:tcPr/>
+                <w:p>
+                  <w:pPr>
+                    <w:pStyle w:val="Compact"/>
+                    <w:jc w:val="left"/>
+                    <w:jc w:val="center"/>
+                  </w:pPr>
+                  <w:r>
+                    <w:t xml:space="preserve">0.42 ( ± 0.03)</w:t>
                   </w:r>
                 </w:p>
               </w:tc>
@@ -3661,33 +3927,33 @@
                     <w:jc w:val="center"/>
                   </w:pPr>
                   <w:r>
-                    <w:t xml:space="preserve">0.64 ( +/- 0.04)</w:t>
-                  </w:r>
-                </w:p>
-              </w:tc>
-              <w:tc>
-                <w:tcPr/>
-                <w:p>
-                  <w:pPr>
-                    <w:pStyle w:val="Compact"/>
-                    <w:jc w:val="left"/>
-                    <w:jc w:val="center"/>
-                  </w:pPr>
-                  <w:r>
-                    <w:t xml:space="preserve">0.62 ( +/- 0.01)</w:t>
-                  </w:r>
-                </w:p>
-              </w:tc>
-              <w:tc>
-                <w:tcPr/>
-                <w:p>
-                  <w:pPr>
-                    <w:pStyle w:val="Compact"/>
-                    <w:jc w:val="left"/>
-                    <w:jc w:val="center"/>
-                  </w:pPr>
-                  <w:r>
-                    <w:t xml:space="preserve">0.65 ( +/- 0.03)</w:t>
+                    <w:t xml:space="preserve">0.64 ( ± 0.04)</w:t>
+                  </w:r>
+                </w:p>
+              </w:tc>
+              <w:tc>
+                <w:tcPr/>
+                <w:p>
+                  <w:pPr>
+                    <w:pStyle w:val="Compact"/>
+                    <w:jc w:val="left"/>
+                    <w:jc w:val="center"/>
+                  </w:pPr>
+                  <w:r>
+                    <w:t xml:space="preserve">0.62 ( ± 0.01)</w:t>
+                  </w:r>
+                </w:p>
+              </w:tc>
+              <w:tc>
+                <w:tcPr/>
+                <w:p>
+                  <w:pPr>
+                    <w:pStyle w:val="Compact"/>
+                    <w:jc w:val="left"/>
+                    <w:jc w:val="center"/>
+                  </w:pPr>
+                  <w:r>
+                    <w:t xml:space="preserve">0.65 ( ± 0.03)</w:t>
                   </w:r>
                 </w:p>
               </w:tc>
@@ -3715,33 +3981,33 @@
                     <w:jc w:val="center"/>
                   </w:pPr>
                   <w:r>
-                    <w:t xml:space="preserve">0.36 ( +/- 0.02)</w:t>
-                  </w:r>
-                </w:p>
-              </w:tc>
-              <w:tc>
-                <w:tcPr/>
-                <w:p>
-                  <w:pPr>
-                    <w:pStyle w:val="Compact"/>
-                    <w:jc w:val="left"/>
-                    <w:jc w:val="center"/>
-                  </w:pPr>
-                  <w:r>
-                    <w:t xml:space="preserve">0.34 ( +/- 0.01)</w:t>
-                  </w:r>
-                </w:p>
-              </w:tc>
-              <w:tc>
-                <w:tcPr/>
-                <w:p>
-                  <w:pPr>
-                    <w:pStyle w:val="Compact"/>
-                    <w:jc w:val="left"/>
-                    <w:jc w:val="center"/>
-                  </w:pPr>
-                  <w:r>
-                    <w:t xml:space="preserve">0.3 ( +/- 0.01)</w:t>
+                    <w:t xml:space="preserve">0.36 ( ± 0.02)</w:t>
+                  </w:r>
+                </w:p>
+              </w:tc>
+              <w:tc>
+                <w:tcPr/>
+                <w:p>
+                  <w:pPr>
+                    <w:pStyle w:val="Compact"/>
+                    <w:jc w:val="left"/>
+                    <w:jc w:val="center"/>
+                  </w:pPr>
+                  <w:r>
+                    <w:t xml:space="preserve">0.34 ( ± 0.01)</w:t>
+                  </w:r>
+                </w:p>
+              </w:tc>
+              <w:tc>
+                <w:tcPr/>
+                <w:p>
+                  <w:pPr>
+                    <w:pStyle w:val="Compact"/>
+                    <w:jc w:val="left"/>
+                    <w:jc w:val="center"/>
+                  </w:pPr>
+                  <w:r>
+                    <w:t xml:space="preserve">0.3 ( ± 0.01)</w:t>
                   </w:r>
                 </w:p>
               </w:tc>
@@ -3769,33 +4035,33 @@
                     <w:jc w:val="center"/>
                   </w:pPr>
                   <w:r>
-                    <w:t xml:space="preserve">0.26 ( +/- 0.02)</w:t>
-                  </w:r>
-                </w:p>
-              </w:tc>
-              <w:tc>
-                <w:tcPr/>
-                <w:p>
-                  <w:pPr>
-                    <w:pStyle w:val="Compact"/>
-                    <w:jc w:val="left"/>
-                    <w:jc w:val="center"/>
-                  </w:pPr>
-                  <w:r>
-                    <w:t xml:space="preserve">0.23 ( +/- 0.01)</w:t>
-                  </w:r>
-                </w:p>
-              </w:tc>
-              <w:tc>
-                <w:tcPr/>
-                <w:p>
-                  <w:pPr>
-                    <w:pStyle w:val="Compact"/>
-                    <w:jc w:val="left"/>
-                    <w:jc w:val="center"/>
-                  </w:pPr>
-                  <w:r>
-                    <w:t xml:space="preserve">0.23 ( +/- 0.02)</w:t>
+                    <w:t xml:space="preserve">0.26 ( ± 0.02)</w:t>
+                  </w:r>
+                </w:p>
+              </w:tc>
+              <w:tc>
+                <w:tcPr/>
+                <w:p>
+                  <w:pPr>
+                    <w:pStyle w:val="Compact"/>
+                    <w:jc w:val="left"/>
+                    <w:jc w:val="center"/>
+                  </w:pPr>
+                  <w:r>
+                    <w:t xml:space="preserve">0.23 ( ± 0.01)</w:t>
+                  </w:r>
+                </w:p>
+              </w:tc>
+              <w:tc>
+                <w:tcPr/>
+                <w:p>
+                  <w:pPr>
+                    <w:pStyle w:val="Compact"/>
+                    <w:jc w:val="left"/>
+                    <w:jc w:val="center"/>
+                  </w:pPr>
+                  <w:r>
+                    <w:t xml:space="preserve">0.23 ( ± 0.02)</w:t>
                   </w:r>
                 </w:p>
               </w:tc>
@@ -3823,33 +4089,33 @@
                     <w:jc w:val="center"/>
                   </w:pPr>
                   <w:r>
-                    <w:t xml:space="preserve">0.24 ( +/- 0.01)</w:t>
-                  </w:r>
-                </w:p>
-              </w:tc>
-              <w:tc>
-                <w:tcPr/>
-                <w:p>
-                  <w:pPr>
-                    <w:pStyle w:val="Compact"/>
-                    <w:jc w:val="left"/>
-                    <w:jc w:val="center"/>
-                  </w:pPr>
-                  <w:r>
-                    <w:t xml:space="preserve">0.24 ( +/- 0.01)</w:t>
-                  </w:r>
-                </w:p>
-              </w:tc>
-              <w:tc>
-                <w:tcPr/>
-                <w:p>
-                  <w:pPr>
-                    <w:pStyle w:val="Compact"/>
-                    <w:jc w:val="left"/>
-                    <w:jc w:val="center"/>
-                  </w:pPr>
-                  <w:r>
-                    <w:t xml:space="preserve">0.23 ( +/- 0.01)</w:t>
+                    <w:t xml:space="preserve">0.24 ( ± 0.01)</w:t>
+                  </w:r>
+                </w:p>
+              </w:tc>
+              <w:tc>
+                <w:tcPr/>
+                <w:p>
+                  <w:pPr>
+                    <w:pStyle w:val="Compact"/>
+                    <w:jc w:val="left"/>
+                    <w:jc w:val="center"/>
+                  </w:pPr>
+                  <w:r>
+                    <w:t xml:space="preserve">0.24 ( ± 0.01)</w:t>
+                  </w:r>
+                </w:p>
+              </w:tc>
+              <w:tc>
+                <w:tcPr/>
+                <w:p>
+                  <w:pPr>
+                    <w:pStyle w:val="Compact"/>
+                    <w:jc w:val="left"/>
+                    <w:jc w:val="center"/>
+                  </w:pPr>
+                  <w:r>
+                    <w:t xml:space="preserve">0.23 ( ± 0.01)</w:t>
                   </w:r>
                 </w:p>
               </w:tc>
@@ -3888,7 +4154,7 @@
         <w:t xml:space="preserve"> </w:t>
       </w:r>
       <w:r>
-        <w:t xml:space="preserve">21.9 ( +/- 0.2)</w:t>
+        <w:t xml:space="preserve">21.9 ( ± 0.2)</w:t>
       </w:r>
       <w:r>
         <w:t xml:space="preserve"> </w:t>
@@ -3900,7 +4166,7 @@
         <w:t xml:space="preserve"> </w:t>
       </w:r>
       <w:r>
-        <w:t xml:space="preserve">21.9 ( +/- 0.3)</w:t>
+        <w:t xml:space="preserve">21.9 ( ± 0.3)</w:t>
       </w:r>
       <w:r>
         <w:t xml:space="preserve"> </w:t>
@@ -3912,7 +4178,7 @@
         <w:t xml:space="preserve"> </w:t>
       </w:r>
       <w:r>
-        <w:t xml:space="preserve">21.9 ( +/- 0.2)</w:t>
+        <w:t xml:space="preserve">21.9 ( ± 0.2)</w:t>
       </w:r>
       <w:r>
         <w:t xml:space="preserve"> </w:t>
@@ -4033,33 +4299,7 @@
         <w:t xml:space="preserve"> </w:t>
       </w:r>
       <w:r>
-        <w:t xml:space="preserve">sensation votes were predominantly in the</w:t>
-      </w:r>
-      <w:r>
-        <w:t xml:space="preserve"> </w:t>
-      </w:r>
-      <w:r>
-        <w:rPr>
-          <w:i/>
-          <w:iCs/>
-        </w:rPr>
-        <w:t xml:space="preserve">Neutral</w:t>
-      </w:r>
-      <w:r>
-        <w:t xml:space="preserve"> </w:t>
-      </w:r>
-      <w:r>
-        <w:t xml:space="preserve">to</w:t>
-      </w:r>
-      <w:r>
-        <w:t xml:space="preserve"> </w:t>
-      </w:r>
-      <w:r>
-        <w:rPr>
-          <w:i/>
-          <w:iCs/>
-        </w:rPr>
-        <w:t xml:space="preserve">Slightly cool</w:t>
+        <w:t xml:space="preserve">sensation votes were predominantly in the Neutral to Slightly cool</w:t>
       </w:r>
       <w:r>
         <w:t xml:space="preserve"> </w:t>
@@ -4077,39 +4317,7 @@
         <w:t xml:space="preserve"> </w:t>
       </w:r>
       <w:r>
-        <w:t xml:space="preserve">of participants reporting sensations between</w:t>
-      </w:r>
-      <w:r>
-        <w:t xml:space="preserve"> </w:t>
-      </w:r>
-      <w:r>
-        <w:rPr>
-          <w:i/>
-          <w:iCs/>
-        </w:rPr>
-        <w:t xml:space="preserve">Cool</w:t>
-      </w:r>
-      <w:r>
-        <w:t xml:space="preserve"> </w:t>
-      </w:r>
-      <w:r>
-        <w:t xml:space="preserve">and</w:t>
-      </w:r>
-      <w:r>
-        <w:t xml:space="preserve"> </w:t>
-      </w:r>
-      <w:r>
-        <w:rPr>
-          <w:i/>
-          <w:iCs/>
-        </w:rPr>
-        <w:t xml:space="preserve">Neutral</w:t>
-      </w:r>
-      <w:r>
-        <w:t xml:space="preserve"> </w:t>
-      </w:r>
-      <w:r>
-        <w:t xml:space="preserve">across</w:t>
+        <w:t xml:space="preserve">of participants reporting sensations between Cool and Neutral across</w:t>
       </w:r>
       <w:r>
         <w:t xml:space="preserve"> </w:t>
@@ -4127,23 +4335,7 @@
         <w:t xml:space="preserve"> </w:t>
       </w:r>
       <w:r>
-        <w:t xml:space="preserve">reported feeling</w:t>
-      </w:r>
-      <w:r>
-        <w:t xml:space="preserve"> </w:t>
-      </w:r>
-      <w:r>
-        <w:rPr>
-          <w:i/>
-          <w:iCs/>
-        </w:rPr>
-        <w:t xml:space="preserve">Slightly cool</w:t>
-      </w:r>
-      <w:r>
-        <w:t xml:space="preserve"> </w:t>
-      </w:r>
-      <w:r>
-        <w:t xml:space="preserve">at the highest air speed, compared to</w:t>
+        <w:t xml:space="preserve">reported feeling Slightly cool at the highest air speed, compared to</w:t>
       </w:r>
       <w:r>
         <w:t xml:space="preserve"> </w:t>
@@ -4181,45 +4373,13 @@
         <w:t xml:space="preserve"> </w:t>
       </w:r>
       <w:r>
-        <w:t xml:space="preserve">of participants preferred</w:t>
-      </w:r>
-      <w:r>
-        <w:t xml:space="preserve"> </w:t>
-      </w:r>
-      <w:r>
-        <w:rPr>
-          <w:i/>
-          <w:iCs/>
-        </w:rPr>
-        <w:t xml:space="preserve">No change</w:t>
-      </w:r>
-      <w:r>
-        <w:t xml:space="preserve"> </w:t>
-      </w:r>
-      <w:r>
-        <w:t xml:space="preserve">to the thermal environment. The</w:t>
-      </w:r>
-      <w:r>
-        <w:t xml:space="preserve"> </w:t>
-      </w:r>
-      <w:r>
-        <w:t xml:space="preserve">proportion preferring</w:t>
-      </w:r>
-      <w:r>
-        <w:t xml:space="preserve"> </w:t>
-      </w:r>
-      <w:r>
-        <w:rPr>
-          <w:i/>
-          <w:iCs/>
-        </w:rPr>
-        <w:t xml:space="preserve">Warmer</w:t>
-      </w:r>
-      <w:r>
-        <w:t xml:space="preserve"> </w:t>
-      </w:r>
-      <w:r>
-        <w:t xml:space="preserve">conditions ranged from</w:t>
+        <w:t xml:space="preserve">of participants preferred No change to the thermal environment. The</w:t>
+      </w:r>
+      <w:r>
+        <w:t xml:space="preserve"> </w:t>
+      </w:r>
+      <w:r>
+        <w:t xml:space="preserve">proportion preferring Warmer conditions ranged from</w:t>
       </w:r>
       <w:r>
         <w:t xml:space="preserve"> </w:t>
@@ -5581,7 +5741,19 @@
               <w:t xml:space="preserve"> </w:t>
             </w:r>
             <w:r>
-              <w:t xml:space="preserve">magnitude of model overestimation); (b) calibration curve of the existing model on this study dataset.</w:t>
+              <w:t xml:space="preserve">magnitude of model overestimation); (b) calibration curve of the</w:t>
+            </w:r>
+            <w:r>
+              <w:t xml:space="preserve"> </w:t>
+            </w:r>
+            <w:r>
+              <w:t xml:space="preserve">existing model on this study</w:t>
+            </w:r>
+            <w:r>
+              <w:t xml:space="preserve"> </w:t>
+            </w:r>
+            <w:r>
+              <w:t xml:space="preserve">dataset.</w:t>
             </w:r>
           </w:p>
           <w:bookmarkEnd w:id="74"/>
@@ -5593,7 +5765,25 @@
         <w:pStyle w:val="BodyText"/>
       </w:pPr>
       <w:r>
-        <w:t xml:space="preserve">In addition, we evaluated the performance of the existing ankle draft model by fitting its predictions—based on local air speed and whole-body thermal sensation—against our observed binary satisfaction outcomes using logistic regression. The resulting calibration curve is shown in</w:t>
+        <w:t xml:space="preserve">In addition, we evaluated the performance of the existing ankle draft</w:t>
+      </w:r>
+      <w:r>
+        <w:t xml:space="preserve"> </w:t>
+      </w:r>
+      <w:r>
+        <w:t xml:space="preserve">model by fitting its predictions—based on local air speed and whole-body</w:t>
+      </w:r>
+      <w:r>
+        <w:t xml:space="preserve"> </w:t>
+      </w:r>
+      <w:r>
+        <w:t xml:space="preserve">thermal sensation—against our observed binary satisfaction outcomes</w:t>
+      </w:r>
+      <w:r>
+        <w:t xml:space="preserve"> </w:t>
+      </w:r>
+      <w:r>
+        <w:t xml:space="preserve">using logistic regression. The resulting calibration curve is shown in</w:t>
       </w:r>
       <w:r>
         <w:t xml:space="preserve"> </w:t>
@@ -5607,7 +5797,19 @@
         </w:r>
       </w:hyperlink>
       <w:r>
-        <w:t xml:space="preserve">(b). In a well-calibrated model, the curve should closely follow the 45° ideal line; however, our results show the curve located predominantly below this line.</w:t>
+        <w:t xml:space="preserve">(b). In a well-calibrated model, the curve should closely</w:t>
+      </w:r>
+      <w:r>
+        <w:t xml:space="preserve"> </w:t>
+      </w:r>
+      <w:r>
+        <w:t xml:space="preserve">follow the 45° ideal line; however, our results show the curve located</w:t>
+      </w:r>
+      <w:r>
+        <w:t xml:space="preserve"> </w:t>
+      </w:r>
+      <w:r>
+        <w:t xml:space="preserve">predominantly below this line.</w:t>
       </w:r>
     </w:p>
     <w:p>
@@ -5615,7 +5817,43 @@
         <w:pStyle w:val="BodyText"/>
       </w:pPr>
       <w:r>
-        <w:t xml:space="preserve">While the model maintained acceptable discriminative ability (AUC = 0.77), meaning it can effectively rank which conditions are more likely to cause discomfort, the calibration statistics reveal significant inaccuracy in the magnitude of its predictions. With a Brier score of 0.14 and a systematic shift away from the ideal line, the results confirm that the existing model consistently overestimates the probability of ankle draft dissatisfaction under winter conditions.</w:t>
+        <w:t xml:space="preserve">While the model maintained acceptable discriminative ability (AUC =</w:t>
+      </w:r>
+      <w:r>
+        <w:t xml:space="preserve"> </w:t>
+      </w:r>
+      <w:r>
+        <w:t xml:space="preserve">0.77), meaning it can effectively rank which conditions are more likely</w:t>
+      </w:r>
+      <w:r>
+        <w:t xml:space="preserve"> </w:t>
+      </w:r>
+      <w:r>
+        <w:t xml:space="preserve">to cause discomfort, the calibration statistics reveal significant</w:t>
+      </w:r>
+      <w:r>
+        <w:t xml:space="preserve"> </w:t>
+      </w:r>
+      <w:r>
+        <w:t xml:space="preserve">inaccuracy in the magnitude of its predictions. With a Brier score of</w:t>
+      </w:r>
+      <w:r>
+        <w:t xml:space="preserve"> </w:t>
+      </w:r>
+      <w:r>
+        <w:t xml:space="preserve">0.14 and a systematic shift away from the ideal line, the results</w:t>
+      </w:r>
+      <w:r>
+        <w:t xml:space="preserve"> </w:t>
+      </w:r>
+      <w:r>
+        <w:t xml:space="preserve">confirm that the existing model consistently overestimates the</w:t>
+      </w:r>
+      <w:r>
+        <w:t xml:space="preserve"> </w:t>
+      </w:r>
+      <w:r>
+        <w:t xml:space="preserve">probability of ankle draft dissatisfaction under winter conditions.</w:t>
       </w:r>
     </w:p>
     <w:bookmarkEnd w:id="75"/>
@@ -5677,16 +5915,14 @@
         <w:t xml:space="preserve"> </w:t>
       </w:r>
       <w:r>
-        <w:t xml:space="preserve">(</w:t>
-      </w:r>
-      <w:hyperlink w:anchor="X6db9ee06047343b5a979eff92cb52861c742c6d">
+        <w:t xml:space="preserve">Liu et al. (</w:t>
+      </w:r>
+      <w:hyperlink w:anchor="X0e41857b9754d3f46055296e8711d0a459bcc8a">
         <w:r>
           <w:rPr>
             <w:rStyle w:val="Hyperlink"/>
-            <w:b/>
-            <w:bCs/>
           </w:rPr>
-          <w:t xml:space="preserve">liuPredictedPercentageDissatisfied2017Liu?</w:t>
+          <w:t xml:space="preserve">2017</w:t>
         </w:r>
       </w:hyperlink>
       <w:r>
@@ -5696,13 +5932,13 @@
         <w:t xml:space="preserve"> </w:t>
       </w:r>
       <w:r>
-        <w:t xml:space="preserve">and collected in this study</w:t>
-      </w:r>
-      <w:r>
-        <w:t xml:space="preserve"> </w:t>
-      </w:r>
-      <w:r>
-        <w:t xml:space="preserve">in the modeling dataset. To identify significant predictors, a model</w:t>
+        <w:t xml:space="preserve">and collected in this study in</w:t>
+      </w:r>
+      <w:r>
+        <w:t xml:space="preserve"> </w:t>
+      </w:r>
+      <w:r>
+        <w:t xml:space="preserve">the modeling dataset. To identify significant predictors, a model</w:t>
       </w:r>
       <w:r>
         <w:t xml:space="preserve"> </w:t>
@@ -9547,7 +9783,7 @@
       </w:r>
     </w:p>
     <w:bookmarkEnd w:id="95"/>
-    <w:bookmarkStart w:id="133" w:name="references"/>
+    <w:bookmarkStart w:id="140" w:name="references"/>
     <w:p>
       <w:pPr>
         <w:pStyle w:val="Heading1"/>
@@ -9556,7 +9792,7 @@
         <w:t xml:space="preserve">References</w:t>
       </w:r>
     </w:p>
-    <w:bookmarkStart w:id="132" w:name="refs"/>
+    <w:bookmarkStart w:id="139" w:name="refs"/>
     <w:bookmarkStart w:id="96" w:name="ref-ashraeANSIASHRAEStandard2023"/>
     <w:p>
       <w:pPr>
@@ -9898,7 +10134,54 @@
       </w:hyperlink>
     </w:p>
     <w:bookmarkEnd w:id="103"/>
-    <w:bookmarkStart w:id="105" w:name="X9df5917af8f84de39d37f25bb914b381b4d01ad"/>
+    <w:bookmarkStart w:id="105" w:name="ref-fangerAirTurbulenceSensation1988"/>
+    <w:p>
+      <w:pPr>
+        <w:pStyle w:val="Bibliography"/>
+      </w:pPr>
+      <w:r>
+        <w:t xml:space="preserve">Fanger, P. O., Melikov, A. K., Hanzawa, H., &amp; Ring, J. (1988). Air turbulence and sensation of draught.</w:t>
+      </w:r>
+      <w:r>
+        <w:t xml:space="preserve"> </w:t>
+      </w:r>
+      <w:r>
+        <w:rPr>
+          <w:i/>
+          <w:iCs/>
+        </w:rPr>
+        <w:t xml:space="preserve">Energy and Buildings</w:t>
+      </w:r>
+      <w:r>
+        <w:t xml:space="preserve">,</w:t>
+      </w:r>
+      <w:r>
+        <w:t xml:space="preserve"> </w:t>
+      </w:r>
+      <w:r>
+        <w:rPr>
+          <w:i/>
+          <w:iCs/>
+        </w:rPr>
+        <w:t xml:space="preserve">12</w:t>
+      </w:r>
+      <w:r>
+        <w:t xml:space="preserve">(1), 21–39.</w:t>
+      </w:r>
+      <w:r>
+        <w:t xml:space="preserve"> </w:t>
+      </w:r>
+      <w:hyperlink r:id="rId104">
+        <w:r>
+          <w:rPr>
+            <w:rStyle w:val="Hyperlink"/>
+          </w:rPr>
+          <w:t xml:space="preserve">https://doi.org/10.1016/0378-7788(88)90053-9</w:t>
+        </w:r>
+      </w:hyperlink>
+    </w:p>
+    <w:bookmarkEnd w:id="105"/>
+    <w:bookmarkStart w:id="107" w:name="X9df5917af8f84de39d37f25bb914b381b4d01ad"/>
     <w:p>
       <w:pPr>
         <w:pStyle w:val="Bibliography"/>
@@ -9974,7 +10257,7 @@
       <w:r>
         <w:t xml:space="preserve"> </w:t>
       </w:r>
-      <w:hyperlink r:id="rId104">
+      <w:hyperlink r:id="rId106">
         <w:r>
           <w:rPr>
             <w:rStyle w:val="Hyperlink"/>
@@ -9983,14 +10266,14 @@
         </w:r>
       </w:hyperlink>
     </w:p>
-    <w:bookmarkEnd w:id="105"/>
-    <w:bookmarkStart w:id="106" w:name="ref-heiselbergDraftComfortReview1994"/>
+    <w:bookmarkEnd w:id="107"/>
+    <w:bookmarkStart w:id="109" w:name="ref-heiselbergDraughtRiskCold1994"/>
     <w:p>
       <w:pPr>
         <w:pStyle w:val="Bibliography"/>
       </w:pPr>
       <w:r>
-        <w:t xml:space="preserve">Heiselberg, P. (1994). Draft from cold vertical surfaces: A review of the state of the art.</w:t>
+        <w:t xml:space="preserve">Heiselberg, P. (1994). Draught risk from cold vertical surfaces.</w:t>
       </w:r>
       <w:r>
         <w:t xml:space="preserve"> </w:t>
@@ -10000,7 +10283,7 @@
           <w:i/>
           <w:iCs/>
         </w:rPr>
-        <w:t xml:space="preserve">ASHRAE Transactions</w:t>
+        <w:t xml:space="preserve">Special Issue Papers from Indoor Air ’93</w:t>
       </w:r>
       <w:r>
         <w:t xml:space="preserve">,</w:t>
@@ -10013,14 +10296,22 @@
           <w:i/>
           <w:iCs/>
         </w:rPr>
-        <w:t xml:space="preserve">100</w:t>
-      </w:r>
-      <w:r>
-        <w:t xml:space="preserve">, 1073–1081.</w:t>
-      </w:r>
-    </w:p>
-    <w:bookmarkEnd w:id="106"/>
-    <w:bookmarkStart w:id="107" w:name="ref-KenshaloCoolThresholds1968"/>
+        <w:t xml:space="preserve">29</w:t>
+      </w:r>
+      <w:r>
+        <w:t xml:space="preserve">(3), 297–301. https://doi.org/</w:t>
+      </w:r>
+      <w:hyperlink r:id="rId108">
+        <w:r>
+          <w:rPr>
+            <w:rStyle w:val="Hyperlink"/>
+          </w:rPr>
+          <w:t xml:space="preserve">https://doi.org/10.1016/0360-1323(94)90026-4</w:t>
+        </w:r>
+      </w:hyperlink>
+    </w:p>
+    <w:bookmarkEnd w:id="109"/>
+    <w:bookmarkStart w:id="110" w:name="ref-KenshaloCoolThresholds1968"/>
     <w:p>
       <w:pPr>
         <w:pStyle w:val="Bibliography"/>
@@ -10055,8 +10346,55 @@
         <w:t xml:space="preserve">, 81–84.</w:t>
       </w:r>
     </w:p>
-    <w:bookmarkEnd w:id="107"/>
-    <w:bookmarkStart w:id="109" w:name="ref-lee3DQuantificationMicroclimate2007"/>
+    <w:bookmarkEnd w:id="110"/>
+    <w:bookmarkStart w:id="112" w:name="Xeba2464567e621ce2a405bbbf83703f55acd515"/>
+    <w:p>
+      <w:pPr>
+        <w:pStyle w:val="Bibliography"/>
+      </w:pPr>
+      <w:r>
+        <w:t xml:space="preserve">Larsson, U., &amp; Moshfegh, B. (2002). Experimental investigation of downdraught from well-insulated windows.</w:t>
+      </w:r>
+      <w:r>
+        <w:t xml:space="preserve"> </w:t>
+      </w:r>
+      <w:r>
+        <w:rPr>
+          <w:i/>
+          <w:iCs/>
+        </w:rPr>
+        <w:t xml:space="preserve">Building and Environment</w:t>
+      </w:r>
+      <w:r>
+        <w:t xml:space="preserve">,</w:t>
+      </w:r>
+      <w:r>
+        <w:t xml:space="preserve"> </w:t>
+      </w:r>
+      <w:r>
+        <w:rPr>
+          <w:i/>
+          <w:iCs/>
+        </w:rPr>
+        <w:t xml:space="preserve">37</w:t>
+      </w:r>
+      <w:r>
+        <w:t xml:space="preserve">(11), 1073–1082.</w:t>
+      </w:r>
+      <w:r>
+        <w:t xml:space="preserve"> </w:t>
+      </w:r>
+      <w:hyperlink r:id="rId111">
+        <w:r>
+          <w:rPr>
+            <w:rStyle w:val="Hyperlink"/>
+          </w:rPr>
+          <w:t xml:space="preserve">https://doi.org/10.1016/S0360-1323(01)00110-X</w:t>
+        </w:r>
+      </w:hyperlink>
+    </w:p>
+    <w:bookmarkEnd w:id="112"/>
+    <w:bookmarkStart w:id="114" w:name="ref-lee3DQuantificationMicroclimate2007"/>
     <w:p>
       <w:pPr>
         <w:pStyle w:val="Bibliography"/>
@@ -10093,7 +10431,7 @@
       <w:r>
         <w:t xml:space="preserve"> </w:t>
       </w:r>
-      <w:hyperlink r:id="rId108">
+      <w:hyperlink r:id="rId113">
         <w:r>
           <w:rPr>
             <w:rStyle w:val="Hyperlink"/>
@@ -10102,8 +10440,8 @@
         </w:r>
       </w:hyperlink>
     </w:p>
-    <w:bookmarkEnd w:id="109"/>
-    <w:bookmarkStart w:id="111" w:name="X0e41857b9754d3f46055296e8711d0a459bcc8a"/>
+    <w:bookmarkEnd w:id="114"/>
+    <w:bookmarkStart w:id="116" w:name="X0e41857b9754d3f46055296e8711d0a459bcc8a"/>
     <w:p>
       <w:pPr>
         <w:pStyle w:val="Bibliography"/>
@@ -10140,7 +10478,7 @@
       <w:r>
         <w:t xml:space="preserve"> </w:t>
       </w:r>
-      <w:hyperlink r:id="rId110">
+      <w:hyperlink r:id="rId115">
         <w:r>
           <w:rPr>
             <w:rStyle w:val="Hyperlink"/>
@@ -10149,8 +10487,8 @@
         </w:r>
       </w:hyperlink>
     </w:p>
-    <w:bookmarkEnd w:id="111"/>
-    <w:bookmarkStart w:id="113" w:name="ref-lyonsWindowPerformanceHuman1999"/>
+    <w:bookmarkEnd w:id="116"/>
+    <w:bookmarkStart w:id="118" w:name="ref-lyonsWindowPerformanceHuman1999"/>
     <w:p>
       <w:pPr>
         <w:pStyle w:val="Bibliography"/>
@@ -10247,7 +10585,7 @@
       <w:r>
         <w:t xml:space="preserve"> </w:t>
       </w:r>
-      <w:hyperlink r:id="rId112">
+      <w:hyperlink r:id="rId117">
         <w:r>
           <w:rPr>
             <w:rStyle w:val="Hyperlink"/>
@@ -10256,8 +10594,55 @@
         </w:r>
       </w:hyperlink>
     </w:p>
-    <w:bookmarkEnd w:id="113"/>
-    <w:bookmarkStart w:id="115" w:name="ref-neuhausKalbfleischHauck1991"/>
+    <w:bookmarkEnd w:id="118"/>
+    <w:bookmarkStart w:id="120" w:name="ref-manzAnalysisThermalComfort2004"/>
+    <w:p>
+      <w:pPr>
+        <w:pStyle w:val="Bibliography"/>
+      </w:pPr>
+      <w:r>
+        <w:t xml:space="preserve">Manz, H., &amp; Frank, T. (2004). Analysis of thermal comfort near cold vertical surfaces by means of computational fluid dynamics.</w:t>
+      </w:r>
+      <w:r>
+        <w:t xml:space="preserve"> </w:t>
+      </w:r>
+      <w:r>
+        <w:rPr>
+          <w:i/>
+          <w:iCs/>
+        </w:rPr>
+        <w:t xml:space="preserve">Indoor + Built Environment</w:t>
+      </w:r>
+      <w:r>
+        <w:t xml:space="preserve">,</w:t>
+      </w:r>
+      <w:r>
+        <w:t xml:space="preserve"> </w:t>
+      </w:r>
+      <w:r>
+        <w:rPr>
+          <w:i/>
+          <w:iCs/>
+        </w:rPr>
+        <w:t xml:space="preserve">13</w:t>
+      </w:r>
+      <w:r>
+        <w:t xml:space="preserve">(3), 233–242.</w:t>
+      </w:r>
+      <w:r>
+        <w:t xml:space="preserve"> </w:t>
+      </w:r>
+      <w:hyperlink r:id="rId119">
+        <w:r>
+          <w:rPr>
+            <w:rStyle w:val="Hyperlink"/>
+          </w:rPr>
+          <w:t xml:space="preserve">https://doi.org/10.1177/1420326X04043733</w:t>
+        </w:r>
+      </w:hyperlink>
+    </w:p>
+    <w:bookmarkEnd w:id="120"/>
+    <w:bookmarkStart w:id="122" w:name="ref-neuhausKalbfleischHauck1991"/>
     <w:p>
       <w:pPr>
         <w:pStyle w:val="Bibliography"/>
@@ -10294,7 +10679,7 @@
       <w:r>
         <w:t xml:space="preserve"> </w:t>
       </w:r>
-      <w:hyperlink r:id="rId114">
+      <w:hyperlink r:id="rId121">
         <w:r>
           <w:rPr>
             <w:rStyle w:val="Hyperlink"/>
@@ -10303,8 +10688,8 @@
         </w:r>
       </w:hyperlink>
     </w:p>
-    <w:bookmarkEnd w:id="115"/>
-    <w:bookmarkStart w:id="117" w:name="ref-schiavonSensationDraftUncovered2016"/>
+    <w:bookmarkEnd w:id="122"/>
+    <w:bookmarkStart w:id="124" w:name="ref-schiavonSensationDraftUncovered2016"/>
     <w:p>
       <w:pPr>
         <w:pStyle w:val="Bibliography"/>
@@ -10341,7 +10726,7 @@
       <w:r>
         <w:t xml:space="preserve"> </w:t>
       </w:r>
-      <w:hyperlink r:id="rId116">
+      <w:hyperlink r:id="rId123">
         <w:r>
           <w:rPr>
             <w:rStyle w:val="Hyperlink"/>
@@ -10350,8 +10735,8 @@
         </w:r>
       </w:hyperlink>
     </w:p>
-    <w:bookmarkEnd w:id="117"/>
-    <w:bookmarkStart w:id="119" w:name="ref-schweikerThermalExpectation2020"/>
+    <w:bookmarkEnd w:id="124"/>
+    <w:bookmarkStart w:id="126" w:name="ref-schweikerThermalExpectation2020"/>
     <w:p>
       <w:pPr>
         <w:pStyle w:val="Bibliography"/>
@@ -10388,7 +10773,7 @@
       <w:r>
         <w:t xml:space="preserve"> </w:t>
       </w:r>
-      <w:hyperlink r:id="rId118">
+      <w:hyperlink r:id="rId125">
         <w:r>
           <w:rPr>
             <w:rStyle w:val="Hyperlink"/>
@@ -10397,8 +10782,8 @@
         </w:r>
       </w:hyperlink>
     </w:p>
-    <w:bookmarkEnd w:id="119"/>
-    <w:bookmarkStart w:id="121" w:name="ref-tartariniCBEThermalComfort2020"/>
+    <w:bookmarkEnd w:id="126"/>
+    <w:bookmarkStart w:id="128" w:name="ref-tartariniCBEThermalComfort2020"/>
     <w:p>
       <w:pPr>
         <w:pStyle w:val="Bibliography"/>
@@ -10432,7 +10817,7 @@
       <w:r>
         <w:t xml:space="preserve">, 100563. https://doi.org/</w:t>
       </w:r>
-      <w:hyperlink r:id="rId120">
+      <w:hyperlink r:id="rId127">
         <w:r>
           <w:rPr>
             <w:rStyle w:val="Hyperlink"/>
@@ -10441,8 +10826,8 @@
         </w:r>
       </w:hyperlink>
     </w:p>
-    <w:bookmarkEnd w:id="121"/>
-    <w:bookmarkStart w:id="123" w:name="Xc6822f8f52189dbfe9f84a83a245251ba38a71f"/>
+    <w:bookmarkEnd w:id="128"/>
+    <w:bookmarkStart w:id="130" w:name="Xc6822f8f52189dbfe9f84a83a245251ba38a71f"/>
     <w:p>
       <w:pPr>
         <w:pStyle w:val="Bibliography"/>
@@ -10479,7 +10864,7 @@
       <w:r>
         <w:t xml:space="preserve"> </w:t>
       </w:r>
-      <w:hyperlink r:id="rId122">
+      <w:hyperlink r:id="rId129">
         <w:r>
           <w:rPr>
             <w:rStyle w:val="Hyperlink"/>
@@ -10488,8 +10873,8 @@
         </w:r>
       </w:hyperlink>
     </w:p>
-    <w:bookmarkEnd w:id="123"/>
-    <w:bookmarkStart w:id="125" w:name="ref-vancalster2016"/>
+    <w:bookmarkEnd w:id="130"/>
+    <w:bookmarkStart w:id="132" w:name="ref-vancalster2016"/>
     <w:p>
       <w:pPr>
         <w:pStyle w:val="Bibliography"/>
@@ -10523,7 +10908,7 @@
       <w:r>
         <w:t xml:space="preserve">, 167–176. https://doi.org/</w:t>
       </w:r>
-      <w:hyperlink r:id="rId124">
+      <w:hyperlink r:id="rId131">
         <w:r>
           <w:rPr>
             <w:rStyle w:val="Hyperlink"/>
@@ -10532,8 +10917,8 @@
         </w:r>
       </w:hyperlink>
     </w:p>
-    <w:bookmarkEnd w:id="125"/>
-    <w:bookmarkStart w:id="127" w:name="ref-xuPerceivedControlWinter2021"/>
+    <w:bookmarkEnd w:id="132"/>
+    <w:bookmarkStart w:id="134" w:name="ref-xuPerceivedControlWinter2021"/>
     <w:p>
       <w:pPr>
         <w:pStyle w:val="Bibliography"/>
@@ -10591,7 +10976,7 @@
       <w:r>
         <w:t xml:space="preserve"> </w:t>
       </w:r>
-      <w:hyperlink r:id="rId126">
+      <w:hyperlink r:id="rId133">
         <w:r>
           <w:rPr>
             <w:rStyle w:val="Hyperlink"/>
@@ -10600,8 +10985,8 @@
         </w:r>
       </w:hyperlink>
     </w:p>
-    <w:bookmarkEnd w:id="127"/>
-    <w:bookmarkStart w:id="129" w:name="ref-zhangGroupPerceptionFeedback2022"/>
+    <w:bookmarkEnd w:id="134"/>
+    <w:bookmarkStart w:id="136" w:name="ref-zhangGroupPerceptionFeedback2022"/>
     <w:p>
       <w:pPr>
         <w:pStyle w:val="Bibliography"/>
@@ -10638,7 +11023,7 @@
       <w:r>
         <w:t xml:space="preserve"> </w:t>
       </w:r>
-      <w:hyperlink r:id="rId128">
+      <w:hyperlink r:id="rId135">
         <w:r>
           <w:rPr>
             <w:rStyle w:val="Hyperlink"/>
@@ -10647,8 +11032,8 @@
         </w:r>
       </w:hyperlink>
     </w:p>
-    <w:bookmarkEnd w:id="129"/>
-    <w:bookmarkStart w:id="131" w:name="ref-zhouDraughtSensationAssessment2022"/>
+    <w:bookmarkEnd w:id="136"/>
+    <w:bookmarkStart w:id="138" w:name="ref-zhouDraughtSensationAssessment2022"/>
     <w:p>
       <w:pPr>
         <w:pStyle w:val="Bibliography"/>
@@ -10685,7 +11070,7 @@
       <w:r>
         <w:t xml:space="preserve"> </w:t>
       </w:r>
-      <w:hyperlink r:id="rId130">
+      <w:hyperlink r:id="rId137">
         <w:r>
           <w:rPr>
             <w:rStyle w:val="Hyperlink"/>
@@ -10694,9 +11079,9 @@
         </w:r>
       </w:hyperlink>
     </w:p>
-    <w:bookmarkEnd w:id="131"/>
-    <w:bookmarkEnd w:id="132"/>
-    <w:bookmarkEnd w:id="133"/>
+    <w:bookmarkEnd w:id="138"/>
+    <w:bookmarkEnd w:id="139"/>
+    <w:bookmarkEnd w:id="140"/>
     <w:sectPr>
       <w:footnotePr>
         <w:numRestart w:val="eachSect"/>

</xml_diff>

<commit_message>
fix: hardcode Appendix reference
</commit_message>
<xml_diff>
--- a/docs/manuscript/index.docx
+++ b/docs/manuscript/index.docx
@@ -4537,24 +4537,13 @@
         <w:t xml:space="preserve"> </w:t>
       </w:r>
       <w:r>
-        <w:t xml:space="preserve">having limited influence on whole-body thermal perception (see</w:t>
-      </w:r>
-      <w:r>
-        <w:t xml:space="preserve"> </w:t>
-      </w:r>
-      <w:hyperlink w:anchor="sec-appendix-a.unnumbered">
-        <w:r>
-          <w:rPr>
-            <w:rStyle w:val="Hyperlink"/>
-          </w:rPr>
-          <w:t xml:space="preserve">Section 6</w:t>
-        </w:r>
-      </w:hyperlink>
-      <w:r>
-        <w:t xml:space="preserve"> </w:t>
-      </w:r>
-      <w:r>
-        <w:t xml:space="preserve">for response distributions).</w:t>
+        <w:t xml:space="preserve">having limited influence on whole-body thermal perception (see Appendix</w:t>
+      </w:r>
+      <w:r>
+        <w:t xml:space="preserve"> </w:t>
+      </w:r>
+      <w:r>
+        <w:t xml:space="preserve">A for response distributions).</w:t>
       </w:r>
     </w:p>
     <w:tbl>
@@ -4730,24 +4719,13 @@
         <w:t xml:space="preserve"> </w:t>
       </w:r>
       <w:r>
-        <w:t xml:space="preserve">substantially compromise whole-body thermal comfort (see</w:t>
-      </w:r>
-      <w:r>
-        <w:t xml:space="preserve"> </w:t>
-      </w:r>
-      <w:hyperlink w:anchor="sec-appendix-a.unnumbered">
-        <w:r>
-          <w:rPr>
-            <w:rStyle w:val="Hyperlink"/>
-          </w:rPr>
-          <w:t xml:space="preserve">Section 6</w:t>
-        </w:r>
-      </w:hyperlink>
-      <w:r>
-        <w:t xml:space="preserve"> </w:t>
-      </w:r>
-      <w:r>
-        <w:t xml:space="preserve">for response distributions).</w:t>
+        <w:t xml:space="preserve">substantially compromise whole-body thermal comfort (see Appendix A for</w:t>
+      </w:r>
+      <w:r>
+        <w:t xml:space="preserve"> </w:t>
+      </w:r>
+      <w:r>
+        <w:t xml:space="preserve">response distributions).</w:t>
       </w:r>
     </w:p>
     <w:tbl>
@@ -5026,24 +5004,7 @@
         <w:t xml:space="preserve"> </w:t>
       </w:r>
       <w:r>
-        <w:t xml:space="preserve">(see</w:t>
-      </w:r>
-      <w:r>
-        <w:t xml:space="preserve"> </w:t>
-      </w:r>
-      <w:hyperlink w:anchor="sec-appendix-a.unnumbered">
-        <w:r>
-          <w:rPr>
-            <w:rStyle w:val="Hyperlink"/>
-          </w:rPr>
-          <w:t xml:space="preserve">Section 6</w:t>
-        </w:r>
-      </w:hyperlink>
-      <w:r>
-        <w:t xml:space="preserve"> </w:t>
-      </w:r>
-      <w:r>
-        <w:t xml:space="preserve">for response distributions).</w:t>
+        <w:t xml:space="preserve">(see Appendix A for response distributions).</w:t>
       </w:r>
     </w:p>
     <w:tbl>
@@ -5289,24 +5250,7 @@
         <w:t xml:space="preserve"> </w:t>
       </w:r>
       <w:r>
-        <w:t xml:space="preserve">(see</w:t>
-      </w:r>
-      <w:r>
-        <w:t xml:space="preserve"> </w:t>
-      </w:r>
-      <w:hyperlink w:anchor="sec-appendix-a.unnumbered">
-        <w:r>
-          <w:rPr>
-            <w:rStyle w:val="Hyperlink"/>
-          </w:rPr>
-          <w:t xml:space="preserve">Section 6</w:t>
-        </w:r>
-      </w:hyperlink>
-      <w:r>
-        <w:t xml:space="preserve"> </w:t>
-      </w:r>
-      <w:r>
-        <w:t xml:space="preserve">for response distributions).</w:t>
+        <w:t xml:space="preserve">(see Appendix A for response distributions).</w:t>
       </w:r>
     </w:p>
     <w:tbl>
@@ -10107,13 +10051,13 @@
       </w:r>
     </w:p>
     <w:bookmarkEnd w:id="95"/>
-    <w:bookmarkStart w:id="108" w:name="sec-appendix-a.unnumbered"/>
+    <w:bookmarkStart w:id="108" w:name="sec-appendix-a"/>
     <w:p>
       <w:pPr>
         <w:pStyle w:val="Heading1"/>
       </w:pPr>
       <w:r>
-        <w:t xml:space="preserve">6. Appendix A: Response distributions</w:t>
+        <w:t xml:space="preserve">Appendix A: Response distributions</w:t>
       </w:r>
     </w:p>
     <w:p>

</xml_diff>